<commit_message>
Band 2: Kapitelkoepfe auf Muster A umgestellt (wie Band 1, 5x8)
Sink 44pt, gesperrte graue Versalien KAPITEL X / EPILOG, Titel 17pt.
Manuskript neu kompiliert (~22.140 Woerter). Heading-Ebenen erhalten.
HINWEIS: Band 2 veroeffentlicht -- Re-Upload aendert Seitenzahl.

Co-Authored-By: Claude Opus 4.8 <noreply@anthropic.com>
</commit_message>
<xml_diff>
--- a/Band_2/Linear/Manuskript.docx
+++ b/Band_2/Linear/Manuskript.docx
@@ -636,7 +636,7 @@
     </w:p>
     <w:p>
       <w:pPr>
-        <w:spacing w:after="200"/>
+        <w:spacing w:before="0" w:after="880"/>
       </w:pPr>
     </w:p>
     <w:p>
@@ -644,18 +644,21 @@
         <w:pStyle w:val="Heading2"/>
       </w:pPr>
       <w:r>
-        <w:t>Kapitel 1</w:t>
-      </w:r>
-    </w:p>
-    <w:p>
-      <w:bookmarkStart w:id="36940" w:name="kapitel_1"/>
+        <w:rPr>
+          <w:spacing w:val="52"/>
+        </w:rPr>
+        <w:t>KAPITEL 1</w:t>
+      </w:r>
+    </w:p>
+    <w:p>
+      <w:bookmarkStart w:id="7741" w:name="kapitel_1"/>
       <w:pPr>
         <w:pStyle w:val="Heading1"/>
       </w:pPr>
       <w:r>
         <w:t>Der versiegelte Brief</w:t>
       </w:r>
-      <w:bookmarkEnd w:id="36940"/>
+      <w:bookmarkEnd w:id="7741"/>
     </w:p>
     <w:p>
       <w:pPr>
@@ -2195,7 +2198,7 @@
     </w:p>
     <w:p>
       <w:pPr>
-        <w:spacing w:after="200"/>
+        <w:spacing w:before="0" w:after="880"/>
       </w:pPr>
     </w:p>
     <w:p>
@@ -2203,18 +2206,21 @@
         <w:pStyle w:val="Heading2"/>
       </w:pPr>
       <w:r>
-        <w:t>Kapitel 2</w:t>
-      </w:r>
-    </w:p>
-    <w:p>
-      <w:bookmarkStart w:id="90559" w:name="kapitel_2"/>
+        <w:rPr>
+          <w:spacing w:val="52"/>
+        </w:rPr>
+        <w:t>KAPITEL 2</w:t>
+      </w:r>
+    </w:p>
+    <w:p>
+      <w:bookmarkStart w:id="19761" w:name="kapitel_2"/>
       <w:pPr>
         <w:pStyle w:val="Heading1"/>
       </w:pPr>
       <w:r>
         <w:t>Die Wahrheit über den Brunnen</w:t>
       </w:r>
-      <w:bookmarkEnd w:id="90559"/>
+      <w:bookmarkEnd w:id="19761"/>
     </w:p>
     <w:p>
       <w:pPr>
@@ -3594,7 +3600,7 @@
     </w:p>
     <w:p>
       <w:pPr>
-        <w:spacing w:after="200"/>
+        <w:spacing w:before="0" w:after="880"/>
       </w:pPr>
     </w:p>
     <w:p>
@@ -3602,18 +3608,21 @@
         <w:pStyle w:val="Heading2"/>
       </w:pPr>
       <w:r>
-        <w:t>Kapitel 3</w:t>
-      </w:r>
-    </w:p>
-    <w:p>
-      <w:bookmarkStart w:id="3186" w:name="kapitel_3"/>
+        <w:rPr>
+          <w:spacing w:val="52"/>
+        </w:rPr>
+        <w:t>KAPITEL 3</w:t>
+      </w:r>
+    </w:p>
+    <w:p>
+      <w:bookmarkStart w:id="9565" w:name="kapitel_3"/>
       <w:pPr>
         <w:pStyle w:val="Heading1"/>
       </w:pPr>
       <w:r>
         <w:t>Die vermissten Kinder</w:t>
       </w:r>
-      <w:bookmarkEnd w:id="3186"/>
+      <w:bookmarkEnd w:id="9565"/>
     </w:p>
     <w:p>
       <w:pPr>
@@ -4885,7 +4894,7 @@
     </w:p>
     <w:p>
       <w:pPr>
-        <w:spacing w:after="200"/>
+        <w:spacing w:before="0" w:after="880"/>
       </w:pPr>
     </w:p>
     <w:p>
@@ -4893,18 +4902,21 @@
         <w:pStyle w:val="Heading2"/>
       </w:pPr>
       <w:r>
-        <w:t>Kapitel 4</w:t>
-      </w:r>
-    </w:p>
-    <w:p>
-      <w:bookmarkStart w:id="29744" w:name="kapitel_4"/>
+        <w:rPr>
+          <w:spacing w:val="52"/>
+        </w:rPr>
+        <w:t>KAPITEL 4</w:t>
+      </w:r>
+    </w:p>
+    <w:p>
+      <w:bookmarkStart w:id="83934" w:name="kapitel_4"/>
       <w:pPr>
         <w:pStyle w:val="Heading1"/>
       </w:pPr>
       <w:r>
         <w:t>Geheimtinte</w:t>
       </w:r>
-      <w:bookmarkEnd w:id="29744"/>
+      <w:bookmarkEnd w:id="83934"/>
     </w:p>
     <w:p>
       <w:pPr>
@@ -6140,7 +6152,7 @@
     </w:p>
     <w:p>
       <w:pPr>
-        <w:spacing w:after="200"/>
+        <w:spacing w:before="0" w:after="880"/>
       </w:pPr>
     </w:p>
     <w:p>
@@ -6148,18 +6160,21 @@
         <w:pStyle w:val="Heading2"/>
       </w:pPr>
       <w:r>
-        <w:t>Kapitel 5</w:t>
-      </w:r>
-    </w:p>
-    <w:p>
-      <w:bookmarkStart w:id="2016" w:name="kapitel_5"/>
+        <w:rPr>
+          <w:spacing w:val="52"/>
+        </w:rPr>
+        <w:t>KAPITEL 5</w:t>
+      </w:r>
+    </w:p>
+    <w:p>
+      <w:bookmarkStart w:id="51773" w:name="kapitel_5"/>
       <w:pPr>
         <w:pStyle w:val="Heading1"/>
       </w:pPr>
       <w:r>
         <w:t>Die Zeugin</w:t>
       </w:r>
-      <w:bookmarkEnd w:id="2016"/>
+      <w:bookmarkEnd w:id="51773"/>
     </w:p>
     <w:p>
       <w:pPr>
@@ -7382,7 +7397,7 @@
     </w:p>
     <w:p>
       <w:pPr>
-        <w:spacing w:after="200"/>
+        <w:spacing w:before="0" w:after="880"/>
       </w:pPr>
     </w:p>
     <w:p>
@@ -7390,18 +7405,21 @@
         <w:pStyle w:val="Heading2"/>
       </w:pPr>
       <w:r>
-        <w:t>Kapitel 6</w:t>
-      </w:r>
-    </w:p>
-    <w:p>
-      <w:bookmarkStart w:id="27178" w:name="kapitel_6"/>
+        <w:rPr>
+          <w:spacing w:val="52"/>
+        </w:rPr>
+        <w:t>KAPITEL 6</w:t>
+      </w:r>
+    </w:p>
+    <w:p>
+      <w:bookmarkStart w:id="31273" w:name="kapitel_6"/>
       <w:pPr>
         <w:pStyle w:val="Heading1"/>
       </w:pPr>
       <w:r>
         <w:t>Zurück in den Tunnel</w:t>
       </w:r>
-      <w:bookmarkEnd w:id="27178"/>
+      <w:bookmarkEnd w:id="31273"/>
     </w:p>
     <w:p>
       <w:pPr>
@@ -8783,7 +8801,7 @@
     </w:p>
     <w:p>
       <w:pPr>
-        <w:spacing w:after="200"/>
+        <w:spacing w:before="0" w:after="880"/>
       </w:pPr>
     </w:p>
     <w:p>
@@ -8791,18 +8809,21 @@
         <w:pStyle w:val="Heading2"/>
       </w:pPr>
       <w:r>
-        <w:t>Kapitel 7</w:t>
-      </w:r>
-    </w:p>
-    <w:p>
-      <w:bookmarkStart w:id="48265" w:name="kapitel_7"/>
+        <w:rPr>
+          <w:spacing w:val="52"/>
+        </w:rPr>
+        <w:t>KAPITEL 7</w:t>
+      </w:r>
+    </w:p>
+    <w:p>
+      <w:bookmarkStart w:id="842" w:name="kapitel_7"/>
       <w:pPr>
         <w:pStyle w:val="Heading1"/>
       </w:pPr>
       <w:r>
         <w:t>Meiers Geständnis</w:t>
       </w:r>
-      <w:bookmarkEnd w:id="48265"/>
+      <w:bookmarkEnd w:id="842"/>
     </w:p>
     <w:p>
       <w:pPr>
@@ -10171,7 +10192,7 @@
     </w:p>
     <w:p>
       <w:pPr>
-        <w:spacing w:after="200"/>
+        <w:spacing w:before="0" w:after="880"/>
       </w:pPr>
     </w:p>
     <w:p>
@@ -10179,18 +10200,21 @@
         <w:pStyle w:val="Heading2"/>
       </w:pPr>
       <w:r>
-        <w:t>Kapitel 8</w:t>
-      </w:r>
-    </w:p>
-    <w:p>
-      <w:bookmarkStart w:id="91357" w:name="kapitel_8"/>
+        <w:rPr>
+          <w:spacing w:val="52"/>
+        </w:rPr>
+        <w:t>KAPITEL 8</w:t>
+      </w:r>
+    </w:p>
+    <w:p>
+      <w:bookmarkStart w:id="59307" w:name="kapitel_8"/>
       <w:pPr>
         <w:pStyle w:val="Heading1"/>
       </w:pPr>
       <w:r>
         <w:t>Das Rätsel der vier Linien</w:t>
       </w:r>
-      <w:bookmarkEnd w:id="91357"/>
+      <w:bookmarkEnd w:id="59307"/>
     </w:p>
     <w:p>
       <w:pPr>
@@ -11727,7 +11751,7 @@
     </w:p>
     <w:p>
       <w:pPr>
-        <w:spacing w:after="200"/>
+        <w:spacing w:before="0" w:after="880"/>
       </w:pPr>
     </w:p>
     <w:p>
@@ -11735,18 +11759,21 @@
         <w:pStyle w:val="Heading2"/>
       </w:pPr>
       <w:r>
-        <w:t>Kapitel 9</w:t>
-      </w:r>
-    </w:p>
-    <w:p>
-      <w:bookmarkStart w:id="99663" w:name="kapitel_9"/>
+        <w:rPr>
+          <w:spacing w:val="52"/>
+        </w:rPr>
+        <w:t>KAPITEL 9</w:t>
+      </w:r>
+    </w:p>
+    <w:p>
+      <w:bookmarkStart w:id="64462" w:name="kapitel_9"/>
       <w:pPr>
         <w:pStyle w:val="Heading1"/>
       </w:pPr>
       <w:r>
         <w:t>Die Treppe</w:t>
       </w:r>
-      <w:bookmarkEnd w:id="99663"/>
+      <w:bookmarkEnd w:id="64462"/>
     </w:p>
     <w:p>
       <w:pPr>
@@ -13258,7 +13285,7 @@
     </w:p>
     <w:p>
       <w:pPr>
-        <w:spacing w:after="200"/>
+        <w:spacing w:before="0" w:after="880"/>
       </w:pPr>
     </w:p>
     <w:p>
@@ -13266,18 +13293,21 @@
         <w:pStyle w:val="Heading2"/>
       </w:pPr>
       <w:r>
-        <w:t>Kapitel 10</w:t>
-      </w:r>
-    </w:p>
-    <w:p>
-      <w:bookmarkStart w:id="35769" w:name="kapitel_10"/>
+        <w:rPr>
+          <w:spacing w:val="52"/>
+        </w:rPr>
+        <w:t>KAPITEL 10</w:t>
+      </w:r>
+    </w:p>
+    <w:p>
+      <w:bookmarkStart w:id="80541" w:name="kapitel_10"/>
       <w:pPr>
         <w:pStyle w:val="Heading1"/>
       </w:pPr>
       <w:r>
         <w:t>Die falsche Abzweigung</w:t>
       </w:r>
-      <w:bookmarkEnd w:id="35769"/>
+      <w:bookmarkEnd w:id="80541"/>
     </w:p>
     <w:p>
       <w:pPr>
@@ -15005,7 +15035,7 @@
     </w:p>
     <w:p>
       <w:pPr>
-        <w:spacing w:after="200"/>
+        <w:spacing w:before="0" w:after="880"/>
       </w:pPr>
     </w:p>
     <w:p>
@@ -15013,18 +15043,21 @@
         <w:pStyle w:val="Heading2"/>
       </w:pPr>
       <w:r>
-        <w:t>Kapitel 11</w:t>
-      </w:r>
-    </w:p>
-    <w:p>
-      <w:bookmarkStart w:id="29809" w:name="kapitel_11"/>
+        <w:rPr>
+          <w:spacing w:val="52"/>
+        </w:rPr>
+        <w:t>KAPITEL 11</w:t>
+      </w:r>
+    </w:p>
+    <w:p>
+      <w:bookmarkStart w:id="88923" w:name="kapitel_11"/>
       <w:pPr>
         <w:pStyle w:val="Heading1"/>
       </w:pPr>
       <w:r>
         <w:t>Eingesperrt</w:t>
       </w:r>
-      <w:bookmarkEnd w:id="29809"/>
+      <w:bookmarkEnd w:id="88923"/>
     </w:p>
     <w:p>
       <w:pPr>
@@ -16776,7 +16809,7 @@
     </w:p>
     <w:p>
       <w:pPr>
-        <w:spacing w:after="200"/>
+        <w:spacing w:before="0" w:after="880"/>
       </w:pPr>
     </w:p>
     <w:p>
@@ -16784,18 +16817,21 @@
         <w:pStyle w:val="Heading2"/>
       </w:pPr>
       <w:r>
-        <w:t>Kapitel 12</w:t>
-      </w:r>
-    </w:p>
-    <w:p>
-      <w:bookmarkStart w:id="50827" w:name="kapitel_12"/>
+        <w:rPr>
+          <w:spacing w:val="52"/>
+        </w:rPr>
+        <w:t>KAPITEL 12</w:t>
+      </w:r>
+    </w:p>
+    <w:p>
+      <w:bookmarkStart w:id="83639" w:name="kapitel_12"/>
       <w:pPr>
         <w:pStyle w:val="Heading1"/>
       </w:pPr>
       <w:r>
         <w:t>Die Quelle</w:t>
       </w:r>
-      <w:bookmarkEnd w:id="50827"/>
+      <w:bookmarkEnd w:id="83639"/>
     </w:p>
     <w:p>
       <w:pPr>
@@ -18151,7 +18187,7 @@
     </w:p>
     <w:p>
       <w:pPr>
-        <w:spacing w:after="200"/>
+        <w:spacing w:before="0" w:after="880"/>
       </w:pPr>
     </w:p>
     <w:p>
@@ -18159,18 +18195,21 @@
         <w:pStyle w:val="Heading2"/>
       </w:pPr>
       <w:r>
-        <w:t>Kapitel 13</w:t>
-      </w:r>
-    </w:p>
-    <w:p>
-      <w:bookmarkStart w:id="55322" w:name="kapitel_13"/>
+        <w:rPr>
+          <w:spacing w:val="52"/>
+        </w:rPr>
+        <w:t>KAPITEL 13</w:t>
+      </w:r>
+    </w:p>
+    <w:p>
+      <w:bookmarkStart w:id="59751" w:name="kapitel_13"/>
       <w:pPr>
         <w:pStyle w:val="Heading1"/>
       </w:pPr>
       <w:r>
         <w:t>Bens Plan</w:t>
       </w:r>
-      <w:bookmarkEnd w:id="55322"/>
+      <w:bookmarkEnd w:id="59751"/>
     </w:p>
     <w:p>
       <w:pPr>
@@ -19753,7 +19792,7 @@
     </w:p>
     <w:p>
       <w:pPr>
-        <w:spacing w:after="200"/>
+        <w:spacing w:before="0" w:after="880"/>
       </w:pPr>
     </w:p>
     <w:p>
@@ -19761,18 +19800,21 @@
         <w:pStyle w:val="Heading2"/>
       </w:pPr>
       <w:r>
-        <w:t>Kapitel 14</w:t>
-      </w:r>
-    </w:p>
-    <w:p>
-      <w:bookmarkStart w:id="70681" w:name="kapitel_14"/>
+        <w:rPr>
+          <w:spacing w:val="52"/>
+        </w:rPr>
+        <w:t>KAPITEL 14</w:t>
+      </w:r>
+    </w:p>
+    <w:p>
+      <w:bookmarkStart w:id="78965" w:name="kapitel_14"/>
       <w:pPr>
         <w:pStyle w:val="Heading1"/>
       </w:pPr>
       <w:r>
         <w:t>Der Aufstieg</w:t>
       </w:r>
-      <w:bookmarkEnd w:id="70681"/>
+      <w:bookmarkEnd w:id="78965"/>
     </w:p>
     <w:p>
       <w:pPr>
@@ -21464,7 +21506,7 @@
     </w:p>
     <w:p>
       <w:pPr>
-        <w:spacing w:after="200"/>
+        <w:spacing w:before="0" w:after="880"/>
       </w:pPr>
     </w:p>
     <w:p>
@@ -21472,18 +21514,21 @@
         <w:pStyle w:val="Heading2"/>
       </w:pPr>
       <w:r>
-        <w:t>Kapitel 15</w:t>
-      </w:r>
-    </w:p>
-    <w:p>
-      <w:bookmarkStart w:id="80835" w:name="kapitel_15"/>
+        <w:rPr>
+          <w:spacing w:val="52"/>
+        </w:rPr>
+        <w:t>KAPITEL 15</w:t>
+      </w:r>
+    </w:p>
+    <w:p>
+      <w:bookmarkStart w:id="27237" w:name="kapitel_15"/>
       <w:pPr>
         <w:pStyle w:val="Heading1"/>
       </w:pPr>
       <w:r>
         <w:t>Die Zeitkapsel</w:t>
       </w:r>
-      <w:bookmarkEnd w:id="80835"/>
+      <w:bookmarkEnd w:id="27237"/>
     </w:p>
     <w:p>
       <w:pPr>
@@ -22973,7 +23018,7 @@
     </w:p>
     <w:p>
       <w:pPr>
-        <w:spacing w:after="200"/>
+        <w:spacing w:before="0" w:after="880"/>
       </w:pPr>
     </w:p>
     <w:p>
@@ -22981,18 +23026,21 @@
         <w:pStyle w:val="Heading2"/>
       </w:pPr>
       <w:r>
-        <w:t>Kapitel 16</w:t>
-      </w:r>
-    </w:p>
-    <w:p>
-      <w:bookmarkStart w:id="45168" w:name="kapitel_16"/>
+        <w:rPr>
+          <w:spacing w:val="52"/>
+        </w:rPr>
+        <w:t>KAPITEL 16</w:t>
+      </w:r>
+    </w:p>
+    <w:p>
+      <w:bookmarkStart w:id="15043" w:name="kapitel_16"/>
       <w:pPr>
         <w:pStyle w:val="Heading1"/>
       </w:pPr>
       <w:r>
         <w:t>Frau Bergmanns Tränen</w:t>
       </w:r>
-      <w:bookmarkEnd w:id="45168"/>
+      <w:bookmarkEnd w:id="15043"/>
     </w:p>
     <w:p>
       <w:pPr>
@@ -24458,7 +24506,7 @@
     </w:p>
     <w:p>
       <w:pPr>
-        <w:spacing w:after="200"/>
+        <w:spacing w:before="0" w:after="880"/>
       </w:pPr>
     </w:p>
     <w:p>
@@ -24466,18 +24514,21 @@
         <w:pStyle w:val="Heading2"/>
       </w:pPr>
       <w:r>
-        <w:t>Kapitel 17</w:t>
-      </w:r>
-    </w:p>
-    <w:p>
-      <w:bookmarkStart w:id="52615" w:name="kapitel_17"/>
+        <w:rPr>
+          <w:spacing w:val="52"/>
+        </w:rPr>
+        <w:t>KAPITEL 17</w:t>
+      </w:r>
+    </w:p>
+    <w:p>
+      <w:bookmarkStart w:id="86361" w:name="kapitel_17"/>
       <w:pPr>
         <w:pStyle w:val="Heading1"/>
       </w:pPr>
       <w:r>
         <w:t>Das richtige Erbe</w:t>
       </w:r>
-      <w:bookmarkEnd w:id="52615"/>
+      <w:bookmarkEnd w:id="86361"/>
     </w:p>
     <w:p>
       <w:pPr>
@@ -25869,7 +25920,7 @@
     </w:p>
     <w:p>
       <w:pPr>
-        <w:spacing w:after="200"/>
+        <w:spacing w:before="0" w:after="880"/>
       </w:pPr>
     </w:p>
     <w:p>
@@ -25877,18 +25928,21 @@
         <w:pStyle w:val="Heading2"/>
       </w:pPr>
       <w:r>
-        <w:t>Kapitel 18</w:t>
-      </w:r>
-    </w:p>
-    <w:p>
-      <w:bookmarkStart w:id="90978" w:name="kapitel_18"/>
+        <w:rPr>
+          <w:spacing w:val="52"/>
+        </w:rPr>
+        <w:t>KAPITEL 18</w:t>
+      </w:r>
+    </w:p>
+    <w:p>
+      <w:bookmarkStart w:id="8359" w:name="kapitel_18"/>
       <w:pPr>
         <w:pStyle w:val="Heading1"/>
       </w:pPr>
       <w:r>
         <w:t>Der Anruf</w:t>
       </w:r>
-      <w:bookmarkEnd w:id="90978"/>
+      <w:bookmarkEnd w:id="8359"/>
     </w:p>
     <w:p>
       <w:pPr>
@@ -27172,7 +27226,7 @@
     </w:p>
     <w:p>
       <w:pPr>
-        <w:spacing w:after="200"/>
+        <w:spacing w:before="0" w:after="880"/>
       </w:pPr>
     </w:p>
     <w:p>
@@ -27180,18 +27234,21 @@
         <w:pStyle w:val="Heading2"/>
       </w:pPr>
       <w:r>
-        <w:t>Epilog</w:t>
-      </w:r>
-    </w:p>
-    <w:p>
-      <w:bookmarkStart w:id="81134" w:name="kapitel_19"/>
+        <w:rPr>
+          <w:spacing w:val="52"/>
+        </w:rPr>
+        <w:t>EPILOG</w:t>
+      </w:r>
+    </w:p>
+    <w:p>
+      <w:bookmarkStart w:id="69363" w:name="kapitel_19"/>
       <w:pPr>
         <w:pStyle w:val="Heading1"/>
       </w:pPr>
       <w:r>
         <w:t>Bald</w:t>
       </w:r>
-      <w:bookmarkEnd w:id="81134"/>
+      <w:bookmarkEnd w:id="69363"/>
     </w:p>
     <w:p>
       <w:pPr>
@@ -30141,7 +30198,7 @@
       <w:keepNext/>
       <w:keepLines/>
       <w:pageBreakBefore w:val="0"/>
-      <w:spacing w:before="0" w:after="200"/>
+      <w:spacing w:before="0" w:after="440"/>
       <w:jc w:val="center"/>
       <w:outlineLvl w:val="0"/>
     </w:pPr>
@@ -30150,7 +30207,7 @@
       <w:b/>
       <w:bCs/>
       <w:color w:val="000000"/>
-      <w:sz w:val="28"/>
+      <w:sz w:val="34"/>
       <w:szCs w:val="28"/>
     </w:rPr>
   </w:style>
@@ -30166,7 +30223,7 @@
     <w:pPr>
       <w:keepNext/>
       <w:keepLines/>
-      <w:spacing w:before="0" w:after="40"/>
+      <w:spacing w:before="0" w:after="280"/>
       <w:jc w:val="center"/>
       <w:outlineLvl w:val="1"/>
     </w:pPr>
@@ -30174,7 +30231,7 @@
       <w:rFonts w:asciiTheme="majorHAnsi" w:eastAsiaTheme="majorEastAsia" w:hAnsiTheme="majorHAnsi" w:cstheme="majorBidi" w:ascii="Georgia" w:hAnsi="Georgia"/>
       <w:b w:val="0"/>
       <w:bCs/>
-      <w:color w:val="646464"/>
+      <w:color w:val="5A5A5A"/>
       <w:sz w:val="22"/>
       <w:szCs w:val="26"/>
     </w:rPr>

</xml_diff>

<commit_message>
Band 2: Format 5x8 -> 6x9 (Manuskript + Cover)
KDP-Fehler: erwartet 12.597x9.250 (6x9), eingereicht 10.588x8.250 (5x8).
Ursache: Band 2 wurde auf 6x9 umgestellt, meine Dateien waren 5x8.

- create_manuscript.py: Seite 15,24x22,86 cm (6x9), Sink 44->56pt (wie Band 4).
  Neu kompiliert.
- build_cover_band2.py: TRIM 6x9, PAGE_COUNT 154 (aus erwarteter Coverbreite
  abgeleitet), Ausgabe 12.597x9.250 -- passt aufs KDP-Sollmass.
- Panels sind 5:8 -> beim Bauen 2,8% oben/unten Zuschnitt. Konzept-Prompts auf
  2:3 umgestellt fuer sauberes Neu-Generieren.

OFFEN: echte Seitenzahl aus dem NEUEN 6x9-Manuskript (Previewer) -- kann von
154 abweichen. Dann Cover final bauen.

Co-Authored-By: Claude Opus 4.8 <noreply@anthropic.com>
</commit_message>
<xml_diff>
--- a/Band_2/Linear/Manuskript.docx
+++ b/Band_2/Linear/Manuskript.docx
@@ -636,7 +636,7 @@
     </w:p>
     <w:p>
       <w:pPr>
-        <w:spacing w:before="0" w:after="880"/>
+        <w:spacing w:before="0" w:after="1120"/>
       </w:pPr>
     </w:p>
     <w:p>
@@ -651,14 +651,14 @@
       </w:r>
     </w:p>
     <w:p>
-      <w:bookmarkStart w:id="7741" w:name="kapitel_1"/>
+      <w:bookmarkStart w:id="49157" w:name="kapitel_1"/>
       <w:pPr>
         <w:pStyle w:val="Heading1"/>
       </w:pPr>
       <w:r>
         <w:t>Der versiegelte Brief</w:t>
       </w:r>
-      <w:bookmarkEnd w:id="7741"/>
+      <w:bookmarkEnd w:id="49157"/>
     </w:p>
     <w:p>
       <w:pPr>
@@ -2198,7 +2198,7 @@
     </w:p>
     <w:p>
       <w:pPr>
-        <w:spacing w:before="0" w:after="880"/>
+        <w:spacing w:before="0" w:after="1120"/>
       </w:pPr>
     </w:p>
     <w:p>
@@ -2213,14 +2213,14 @@
       </w:r>
     </w:p>
     <w:p>
-      <w:bookmarkStart w:id="19761" w:name="kapitel_2"/>
+      <w:bookmarkStart w:id="73101" w:name="kapitel_2"/>
       <w:pPr>
         <w:pStyle w:val="Heading1"/>
       </w:pPr>
       <w:r>
         <w:t>Die Wahrheit über den Brunnen</w:t>
       </w:r>
-      <w:bookmarkEnd w:id="19761"/>
+      <w:bookmarkEnd w:id="73101"/>
     </w:p>
     <w:p>
       <w:pPr>
@@ -3600,7 +3600,7 @@
     </w:p>
     <w:p>
       <w:pPr>
-        <w:spacing w:before="0" w:after="880"/>
+        <w:spacing w:before="0" w:after="1120"/>
       </w:pPr>
     </w:p>
     <w:p>
@@ -3615,14 +3615,14 @@
       </w:r>
     </w:p>
     <w:p>
-      <w:bookmarkStart w:id="9565" w:name="kapitel_3"/>
+      <w:bookmarkStart w:id="2787" w:name="kapitel_3"/>
       <w:pPr>
         <w:pStyle w:val="Heading1"/>
       </w:pPr>
       <w:r>
         <w:t>Die vermissten Kinder</w:t>
       </w:r>
-      <w:bookmarkEnd w:id="9565"/>
+      <w:bookmarkEnd w:id="2787"/>
     </w:p>
     <w:p>
       <w:pPr>
@@ -4894,7 +4894,7 @@
     </w:p>
     <w:p>
       <w:pPr>
-        <w:spacing w:before="0" w:after="880"/>
+        <w:spacing w:before="0" w:after="1120"/>
       </w:pPr>
     </w:p>
     <w:p>
@@ -4909,14 +4909,14 @@
       </w:r>
     </w:p>
     <w:p>
-      <w:bookmarkStart w:id="83934" w:name="kapitel_4"/>
+      <w:bookmarkStart w:id="9128" w:name="kapitel_4"/>
       <w:pPr>
         <w:pStyle w:val="Heading1"/>
       </w:pPr>
       <w:r>
         <w:t>Geheimtinte</w:t>
       </w:r>
-      <w:bookmarkEnd w:id="83934"/>
+      <w:bookmarkEnd w:id="9128"/>
     </w:p>
     <w:p>
       <w:pPr>
@@ -6152,7 +6152,7 @@
     </w:p>
     <w:p>
       <w:pPr>
-        <w:spacing w:before="0" w:after="880"/>
+        <w:spacing w:before="0" w:after="1120"/>
       </w:pPr>
     </w:p>
     <w:p>
@@ -6167,14 +6167,14 @@
       </w:r>
     </w:p>
     <w:p>
-      <w:bookmarkStart w:id="51773" w:name="kapitel_5"/>
+      <w:bookmarkStart w:id="4430" w:name="kapitel_5"/>
       <w:pPr>
         <w:pStyle w:val="Heading1"/>
       </w:pPr>
       <w:r>
         <w:t>Die Zeugin</w:t>
       </w:r>
-      <w:bookmarkEnd w:id="51773"/>
+      <w:bookmarkEnd w:id="4430"/>
     </w:p>
     <w:p>
       <w:pPr>
@@ -7397,7 +7397,7 @@
     </w:p>
     <w:p>
       <w:pPr>
-        <w:spacing w:before="0" w:after="880"/>
+        <w:spacing w:before="0" w:after="1120"/>
       </w:pPr>
     </w:p>
     <w:p>
@@ -7412,14 +7412,14 @@
       </w:r>
     </w:p>
     <w:p>
-      <w:bookmarkStart w:id="31273" w:name="kapitel_6"/>
+      <w:bookmarkStart w:id="85376" w:name="kapitel_6"/>
       <w:pPr>
         <w:pStyle w:val="Heading1"/>
       </w:pPr>
       <w:r>
         <w:t>Zurück in den Tunnel</w:t>
       </w:r>
-      <w:bookmarkEnd w:id="31273"/>
+      <w:bookmarkEnd w:id="85376"/>
     </w:p>
     <w:p>
       <w:pPr>
@@ -8801,7 +8801,7 @@
     </w:p>
     <w:p>
       <w:pPr>
-        <w:spacing w:before="0" w:after="880"/>
+        <w:spacing w:before="0" w:after="1120"/>
       </w:pPr>
     </w:p>
     <w:p>
@@ -8816,14 +8816,14 @@
       </w:r>
     </w:p>
     <w:p>
-      <w:bookmarkStart w:id="842" w:name="kapitel_7"/>
+      <w:bookmarkStart w:id="99875" w:name="kapitel_7"/>
       <w:pPr>
         <w:pStyle w:val="Heading1"/>
       </w:pPr>
       <w:r>
         <w:t>Meiers Geständnis</w:t>
       </w:r>
-      <w:bookmarkEnd w:id="842"/>
+      <w:bookmarkEnd w:id="99875"/>
     </w:p>
     <w:p>
       <w:pPr>
@@ -10192,7 +10192,7 @@
     </w:p>
     <w:p>
       <w:pPr>
-        <w:spacing w:before="0" w:after="880"/>
+        <w:spacing w:before="0" w:after="1120"/>
       </w:pPr>
     </w:p>
     <w:p>
@@ -10207,14 +10207,14 @@
       </w:r>
     </w:p>
     <w:p>
-      <w:bookmarkStart w:id="59307" w:name="kapitel_8"/>
+      <w:bookmarkStart w:id="88938" w:name="kapitel_8"/>
       <w:pPr>
         <w:pStyle w:val="Heading1"/>
       </w:pPr>
       <w:r>
         <w:t>Das Rätsel der vier Linien</w:t>
       </w:r>
-      <w:bookmarkEnd w:id="59307"/>
+      <w:bookmarkEnd w:id="88938"/>
     </w:p>
     <w:p>
       <w:pPr>
@@ -11751,7 +11751,7 @@
     </w:p>
     <w:p>
       <w:pPr>
-        <w:spacing w:before="0" w:after="880"/>
+        <w:spacing w:before="0" w:after="1120"/>
       </w:pPr>
     </w:p>
     <w:p>
@@ -11766,14 +11766,14 @@
       </w:r>
     </w:p>
     <w:p>
-      <w:bookmarkStart w:id="64462" w:name="kapitel_9"/>
+      <w:bookmarkStart w:id="67570" w:name="kapitel_9"/>
       <w:pPr>
         <w:pStyle w:val="Heading1"/>
       </w:pPr>
       <w:r>
         <w:t>Die Treppe</w:t>
       </w:r>
-      <w:bookmarkEnd w:id="64462"/>
+      <w:bookmarkEnd w:id="67570"/>
     </w:p>
     <w:p>
       <w:pPr>
@@ -13285,7 +13285,7 @@
     </w:p>
     <w:p>
       <w:pPr>
-        <w:spacing w:before="0" w:after="880"/>
+        <w:spacing w:before="0" w:after="1120"/>
       </w:pPr>
     </w:p>
     <w:p>
@@ -13300,14 +13300,14 @@
       </w:r>
     </w:p>
     <w:p>
-      <w:bookmarkStart w:id="80541" w:name="kapitel_10"/>
+      <w:bookmarkStart w:id="86903" w:name="kapitel_10"/>
       <w:pPr>
         <w:pStyle w:val="Heading1"/>
       </w:pPr>
       <w:r>
         <w:t>Die falsche Abzweigung</w:t>
       </w:r>
-      <w:bookmarkEnd w:id="80541"/>
+      <w:bookmarkEnd w:id="86903"/>
     </w:p>
     <w:p>
       <w:pPr>
@@ -15035,7 +15035,7 @@
     </w:p>
     <w:p>
       <w:pPr>
-        <w:spacing w:before="0" w:after="880"/>
+        <w:spacing w:before="0" w:after="1120"/>
       </w:pPr>
     </w:p>
     <w:p>
@@ -15050,14 +15050,14 @@
       </w:r>
     </w:p>
     <w:p>
-      <w:bookmarkStart w:id="88923" w:name="kapitel_11"/>
+      <w:bookmarkStart w:id="26786" w:name="kapitel_11"/>
       <w:pPr>
         <w:pStyle w:val="Heading1"/>
       </w:pPr>
       <w:r>
         <w:t>Eingesperrt</w:t>
       </w:r>
-      <w:bookmarkEnd w:id="88923"/>
+      <w:bookmarkEnd w:id="26786"/>
     </w:p>
     <w:p>
       <w:pPr>
@@ -16809,7 +16809,7 @@
     </w:p>
     <w:p>
       <w:pPr>
-        <w:spacing w:before="0" w:after="880"/>
+        <w:spacing w:before="0" w:after="1120"/>
       </w:pPr>
     </w:p>
     <w:p>
@@ -16824,14 +16824,14 @@
       </w:r>
     </w:p>
     <w:p>
-      <w:bookmarkStart w:id="83639" w:name="kapitel_12"/>
+      <w:bookmarkStart w:id="98335" w:name="kapitel_12"/>
       <w:pPr>
         <w:pStyle w:val="Heading1"/>
       </w:pPr>
       <w:r>
         <w:t>Die Quelle</w:t>
       </w:r>
-      <w:bookmarkEnd w:id="83639"/>
+      <w:bookmarkEnd w:id="98335"/>
     </w:p>
     <w:p>
       <w:pPr>
@@ -18187,7 +18187,7 @@
     </w:p>
     <w:p>
       <w:pPr>
-        <w:spacing w:before="0" w:after="880"/>
+        <w:spacing w:before="0" w:after="1120"/>
       </w:pPr>
     </w:p>
     <w:p>
@@ -18202,14 +18202,14 @@
       </w:r>
     </w:p>
     <w:p>
-      <w:bookmarkStart w:id="59751" w:name="kapitel_13"/>
+      <w:bookmarkStart w:id="45531" w:name="kapitel_13"/>
       <w:pPr>
         <w:pStyle w:val="Heading1"/>
       </w:pPr>
       <w:r>
         <w:t>Bens Plan</w:t>
       </w:r>
-      <w:bookmarkEnd w:id="59751"/>
+      <w:bookmarkEnd w:id="45531"/>
     </w:p>
     <w:p>
       <w:pPr>
@@ -19792,7 +19792,7 @@
     </w:p>
     <w:p>
       <w:pPr>
-        <w:spacing w:before="0" w:after="880"/>
+        <w:spacing w:before="0" w:after="1120"/>
       </w:pPr>
     </w:p>
     <w:p>
@@ -19807,14 +19807,14 @@
       </w:r>
     </w:p>
     <w:p>
-      <w:bookmarkStart w:id="78965" w:name="kapitel_14"/>
+      <w:bookmarkStart w:id="3743" w:name="kapitel_14"/>
       <w:pPr>
         <w:pStyle w:val="Heading1"/>
       </w:pPr>
       <w:r>
         <w:t>Der Aufstieg</w:t>
       </w:r>
-      <w:bookmarkEnd w:id="78965"/>
+      <w:bookmarkEnd w:id="3743"/>
     </w:p>
     <w:p>
       <w:pPr>
@@ -21506,7 +21506,7 @@
     </w:p>
     <w:p>
       <w:pPr>
-        <w:spacing w:before="0" w:after="880"/>
+        <w:spacing w:before="0" w:after="1120"/>
       </w:pPr>
     </w:p>
     <w:p>
@@ -21521,14 +21521,14 @@
       </w:r>
     </w:p>
     <w:p>
-      <w:bookmarkStart w:id="27237" w:name="kapitel_15"/>
+      <w:bookmarkStart w:id="5609" w:name="kapitel_15"/>
       <w:pPr>
         <w:pStyle w:val="Heading1"/>
       </w:pPr>
       <w:r>
         <w:t>Die Zeitkapsel</w:t>
       </w:r>
-      <w:bookmarkEnd w:id="27237"/>
+      <w:bookmarkEnd w:id="5609"/>
     </w:p>
     <w:p>
       <w:pPr>
@@ -23018,7 +23018,7 @@
     </w:p>
     <w:p>
       <w:pPr>
-        <w:spacing w:before="0" w:after="880"/>
+        <w:spacing w:before="0" w:after="1120"/>
       </w:pPr>
     </w:p>
     <w:p>
@@ -23033,14 +23033,14 @@
       </w:r>
     </w:p>
     <w:p>
-      <w:bookmarkStart w:id="15043" w:name="kapitel_16"/>
+      <w:bookmarkStart w:id="27126" w:name="kapitel_16"/>
       <w:pPr>
         <w:pStyle w:val="Heading1"/>
       </w:pPr>
       <w:r>
         <w:t>Frau Bergmanns Tränen</w:t>
       </w:r>
-      <w:bookmarkEnd w:id="15043"/>
+      <w:bookmarkEnd w:id="27126"/>
     </w:p>
     <w:p>
       <w:pPr>
@@ -24506,7 +24506,7 @@
     </w:p>
     <w:p>
       <w:pPr>
-        <w:spacing w:before="0" w:after="880"/>
+        <w:spacing w:before="0" w:after="1120"/>
       </w:pPr>
     </w:p>
     <w:p>
@@ -24521,14 +24521,14 @@
       </w:r>
     </w:p>
     <w:p>
-      <w:bookmarkStart w:id="86361" w:name="kapitel_17"/>
+      <w:bookmarkStart w:id="20270" w:name="kapitel_17"/>
       <w:pPr>
         <w:pStyle w:val="Heading1"/>
       </w:pPr>
       <w:r>
         <w:t>Das richtige Erbe</w:t>
       </w:r>
-      <w:bookmarkEnd w:id="86361"/>
+      <w:bookmarkEnd w:id="20270"/>
     </w:p>
     <w:p>
       <w:pPr>
@@ -25920,7 +25920,7 @@
     </w:p>
     <w:p>
       <w:pPr>
-        <w:spacing w:before="0" w:after="880"/>
+        <w:spacing w:before="0" w:after="1120"/>
       </w:pPr>
     </w:p>
     <w:p>
@@ -25935,14 +25935,14 @@
       </w:r>
     </w:p>
     <w:p>
-      <w:bookmarkStart w:id="8359" w:name="kapitel_18"/>
+      <w:bookmarkStart w:id="44614" w:name="kapitel_18"/>
       <w:pPr>
         <w:pStyle w:val="Heading1"/>
       </w:pPr>
       <w:r>
         <w:t>Der Anruf</w:t>
       </w:r>
-      <w:bookmarkEnd w:id="8359"/>
+      <w:bookmarkEnd w:id="44614"/>
     </w:p>
     <w:p>
       <w:pPr>
@@ -27226,7 +27226,7 @@
     </w:p>
     <w:p>
       <w:pPr>
-        <w:spacing w:before="0" w:after="880"/>
+        <w:spacing w:before="0" w:after="1120"/>
       </w:pPr>
     </w:p>
     <w:p>
@@ -27241,14 +27241,14 @@
       </w:r>
     </w:p>
     <w:p>
-      <w:bookmarkStart w:id="69363" w:name="kapitel_19"/>
+      <w:bookmarkStart w:id="61595" w:name="kapitel_19"/>
       <w:pPr>
         <w:pStyle w:val="Heading1"/>
       </w:pPr>
       <w:r>
         <w:t>Bald</w:t>
       </w:r>
-      <w:bookmarkEnd w:id="69363"/>
+      <w:bookmarkEnd w:id="61595"/>
     </w:p>
     <w:p>
       <w:pPr>
@@ -29761,7 +29761,7 @@
       </w:r>
     </w:p>
     <w:sectPr>
-      <w:pgSz w:w="7200" w:h="11520"/>
+      <w:pgSz w:w="8640" w:h="12960"/>
       <w:pgMar w:top="907" w:right="737" w:bottom="907" w:left="1134" w:header="720" w:footer="720" w:gutter="0"/>
       <w:cols w:space="720"/>
       <w:docGrid w:linePitch="360"/>

</xml_diff>

<commit_message>
Band 2: Rezensions-QR-Code im Manuskript (wie Geisterspuerer)
- build_qr_rezension.py (Repo-Wurzel): erzeugt QR-Codes, die direkt aufs
  Amazon-Bewertungsformular fuehren (create-review?asin=...), und liest jeden
  mit OpenCV wieder ein (Gegenprobe -- toter QR im Druck waere unkorrigierbar).
  ASINs: Band 1 B0GNZDSLSH, Band 2 B0GV3LJ1W9.
- Band_2/Cover/qr_rezension_band2.png erzeugt + gegengelesen.
- create_manuscript.py: QR-Block auf der "Eine kleine Bitte"-Seite
  ("Einfach den Code scannen ..." + zentrierter QR 1,5 Zoll + Hinweis).
- Gegenprobe: QR aus dem fertigen docx extrahiert und dekodiert -> korrekt.

OFFEN (Autor): erzeugte URL im Browser oeffnen und pruefen, dass die richtige
Taschenbuch-Bewertungsseite erscheint (ASIN aus Keyword-Recherche, evtl. eBook).

Co-Authored-By: Claude Opus 4.8 <noreply@anthropic.com>
</commit_message>
<xml_diff>
--- a/Band_2/Linear/Manuskript.docx
+++ b/Band_2/Linear/Manuskript.docx
@@ -651,14 +651,14 @@
       </w:r>
     </w:p>
     <w:p>
-      <w:bookmarkStart w:id="49157" w:name="kapitel_1"/>
+      <w:bookmarkStart w:id="7973" w:name="kapitel_1"/>
       <w:pPr>
         <w:pStyle w:val="Heading1"/>
       </w:pPr>
       <w:r>
         <w:t>Der versiegelte Brief</w:t>
       </w:r>
-      <w:bookmarkEnd w:id="49157"/>
+      <w:bookmarkEnd w:id="7973"/>
     </w:p>
     <w:p>
       <w:pPr>
@@ -2213,14 +2213,14 @@
       </w:r>
     </w:p>
     <w:p>
-      <w:bookmarkStart w:id="73101" w:name="kapitel_2"/>
+      <w:bookmarkStart w:id="69870" w:name="kapitel_2"/>
       <w:pPr>
         <w:pStyle w:val="Heading1"/>
       </w:pPr>
       <w:r>
         <w:t>Die Wahrheit über den Brunnen</w:t>
       </w:r>
-      <w:bookmarkEnd w:id="73101"/>
+      <w:bookmarkEnd w:id="69870"/>
     </w:p>
     <w:p>
       <w:pPr>
@@ -3615,14 +3615,14 @@
       </w:r>
     </w:p>
     <w:p>
-      <w:bookmarkStart w:id="2787" w:name="kapitel_3"/>
+      <w:bookmarkStart w:id="60464" w:name="kapitel_3"/>
       <w:pPr>
         <w:pStyle w:val="Heading1"/>
       </w:pPr>
       <w:r>
         <w:t>Die vermissten Kinder</w:t>
       </w:r>
-      <w:bookmarkEnd w:id="2787"/>
+      <w:bookmarkEnd w:id="60464"/>
     </w:p>
     <w:p>
       <w:pPr>
@@ -4909,14 +4909,14 @@
       </w:r>
     </w:p>
     <w:p>
-      <w:bookmarkStart w:id="9128" w:name="kapitel_4"/>
+      <w:bookmarkStart w:id="30858" w:name="kapitel_4"/>
       <w:pPr>
         <w:pStyle w:val="Heading1"/>
       </w:pPr>
       <w:r>
         <w:t>Geheimtinte</w:t>
       </w:r>
-      <w:bookmarkEnd w:id="9128"/>
+      <w:bookmarkEnd w:id="30858"/>
     </w:p>
     <w:p>
       <w:pPr>
@@ -6167,14 +6167,14 @@
       </w:r>
     </w:p>
     <w:p>
-      <w:bookmarkStart w:id="4430" w:name="kapitel_5"/>
+      <w:bookmarkStart w:id="60475" w:name="kapitel_5"/>
       <w:pPr>
         <w:pStyle w:val="Heading1"/>
       </w:pPr>
       <w:r>
         <w:t>Die Zeugin</w:t>
       </w:r>
-      <w:bookmarkEnd w:id="4430"/>
+      <w:bookmarkEnd w:id="60475"/>
     </w:p>
     <w:p>
       <w:pPr>
@@ -7412,14 +7412,14 @@
       </w:r>
     </w:p>
     <w:p>
-      <w:bookmarkStart w:id="85376" w:name="kapitel_6"/>
+      <w:bookmarkStart w:id="28775" w:name="kapitel_6"/>
       <w:pPr>
         <w:pStyle w:val="Heading1"/>
       </w:pPr>
       <w:r>
         <w:t>Zurück in den Tunnel</w:t>
       </w:r>
-      <w:bookmarkEnd w:id="85376"/>
+      <w:bookmarkEnd w:id="28775"/>
     </w:p>
     <w:p>
       <w:pPr>
@@ -8816,14 +8816,14 @@
       </w:r>
     </w:p>
     <w:p>
-      <w:bookmarkStart w:id="99875" w:name="kapitel_7"/>
+      <w:bookmarkStart w:id="64736" w:name="kapitel_7"/>
       <w:pPr>
         <w:pStyle w:val="Heading1"/>
       </w:pPr>
       <w:r>
         <w:t>Meiers Geständnis</w:t>
       </w:r>
-      <w:bookmarkEnd w:id="99875"/>
+      <w:bookmarkEnd w:id="64736"/>
     </w:p>
     <w:p>
       <w:pPr>
@@ -10207,14 +10207,14 @@
       </w:r>
     </w:p>
     <w:p>
-      <w:bookmarkStart w:id="88938" w:name="kapitel_8"/>
+      <w:bookmarkStart w:id="52264" w:name="kapitel_8"/>
       <w:pPr>
         <w:pStyle w:val="Heading1"/>
       </w:pPr>
       <w:r>
         <w:t>Das Rätsel der vier Linien</w:t>
       </w:r>
-      <w:bookmarkEnd w:id="88938"/>
+      <w:bookmarkEnd w:id="52264"/>
     </w:p>
     <w:p>
       <w:pPr>
@@ -11766,14 +11766,14 @@
       </w:r>
     </w:p>
     <w:p>
-      <w:bookmarkStart w:id="67570" w:name="kapitel_9"/>
+      <w:bookmarkStart w:id="44274" w:name="kapitel_9"/>
       <w:pPr>
         <w:pStyle w:val="Heading1"/>
       </w:pPr>
       <w:r>
         <w:t>Die Treppe</w:t>
       </w:r>
-      <w:bookmarkEnd w:id="67570"/>
+      <w:bookmarkEnd w:id="44274"/>
     </w:p>
     <w:p>
       <w:pPr>
@@ -13300,14 +13300,14 @@
       </w:r>
     </w:p>
     <w:p>
-      <w:bookmarkStart w:id="86903" w:name="kapitel_10"/>
+      <w:bookmarkStart w:id="98136" w:name="kapitel_10"/>
       <w:pPr>
         <w:pStyle w:val="Heading1"/>
       </w:pPr>
       <w:r>
         <w:t>Die falsche Abzweigung</w:t>
       </w:r>
-      <w:bookmarkEnd w:id="86903"/>
+      <w:bookmarkEnd w:id="98136"/>
     </w:p>
     <w:p>
       <w:pPr>
@@ -15050,14 +15050,14 @@
       </w:r>
     </w:p>
     <w:p>
-      <w:bookmarkStart w:id="26786" w:name="kapitel_11"/>
+      <w:bookmarkStart w:id="8443" w:name="kapitel_11"/>
       <w:pPr>
         <w:pStyle w:val="Heading1"/>
       </w:pPr>
       <w:r>
         <w:t>Eingesperrt</w:t>
       </w:r>
-      <w:bookmarkEnd w:id="26786"/>
+      <w:bookmarkEnd w:id="8443"/>
     </w:p>
     <w:p>
       <w:pPr>
@@ -16824,14 +16824,14 @@
       </w:r>
     </w:p>
     <w:p>
-      <w:bookmarkStart w:id="98335" w:name="kapitel_12"/>
+      <w:bookmarkStart w:id="68187" w:name="kapitel_12"/>
       <w:pPr>
         <w:pStyle w:val="Heading1"/>
       </w:pPr>
       <w:r>
         <w:t>Die Quelle</w:t>
       </w:r>
-      <w:bookmarkEnd w:id="98335"/>
+      <w:bookmarkEnd w:id="68187"/>
     </w:p>
     <w:p>
       <w:pPr>
@@ -18202,14 +18202,14 @@
       </w:r>
     </w:p>
     <w:p>
-      <w:bookmarkStart w:id="45531" w:name="kapitel_13"/>
+      <w:bookmarkStart w:id="53095" w:name="kapitel_13"/>
       <w:pPr>
         <w:pStyle w:val="Heading1"/>
       </w:pPr>
       <w:r>
         <w:t>Bens Plan</w:t>
       </w:r>
-      <w:bookmarkEnd w:id="45531"/>
+      <w:bookmarkEnd w:id="53095"/>
     </w:p>
     <w:p>
       <w:pPr>
@@ -19807,14 +19807,14 @@
       </w:r>
     </w:p>
     <w:p>
-      <w:bookmarkStart w:id="3743" w:name="kapitel_14"/>
+      <w:bookmarkStart w:id="53942" w:name="kapitel_14"/>
       <w:pPr>
         <w:pStyle w:val="Heading1"/>
       </w:pPr>
       <w:r>
         <w:t>Der Aufstieg</w:t>
       </w:r>
-      <w:bookmarkEnd w:id="3743"/>
+      <w:bookmarkEnd w:id="53942"/>
     </w:p>
     <w:p>
       <w:pPr>
@@ -21521,14 +21521,14 @@
       </w:r>
     </w:p>
     <w:p>
-      <w:bookmarkStart w:id="5609" w:name="kapitel_15"/>
+      <w:bookmarkStart w:id="34681" w:name="kapitel_15"/>
       <w:pPr>
         <w:pStyle w:val="Heading1"/>
       </w:pPr>
       <w:r>
         <w:t>Die Zeitkapsel</w:t>
       </w:r>
-      <w:bookmarkEnd w:id="5609"/>
+      <w:bookmarkEnd w:id="34681"/>
     </w:p>
     <w:p>
       <w:pPr>
@@ -23033,14 +23033,14 @@
       </w:r>
     </w:p>
     <w:p>
-      <w:bookmarkStart w:id="27126" w:name="kapitel_16"/>
+      <w:bookmarkStart w:id="98127" w:name="kapitel_16"/>
       <w:pPr>
         <w:pStyle w:val="Heading1"/>
       </w:pPr>
       <w:r>
         <w:t>Frau Bergmanns Tränen</w:t>
       </w:r>
-      <w:bookmarkEnd w:id="27126"/>
+      <w:bookmarkEnd w:id="98127"/>
     </w:p>
     <w:p>
       <w:pPr>
@@ -24521,14 +24521,14 @@
       </w:r>
     </w:p>
     <w:p>
-      <w:bookmarkStart w:id="20270" w:name="kapitel_17"/>
+      <w:bookmarkStart w:id="54564" w:name="kapitel_17"/>
       <w:pPr>
         <w:pStyle w:val="Heading1"/>
       </w:pPr>
       <w:r>
         <w:t>Das richtige Erbe</w:t>
       </w:r>
-      <w:bookmarkEnd w:id="20270"/>
+      <w:bookmarkEnd w:id="54564"/>
     </w:p>
     <w:p>
       <w:pPr>
@@ -25935,14 +25935,14 @@
       </w:r>
     </w:p>
     <w:p>
-      <w:bookmarkStart w:id="44614" w:name="kapitel_18"/>
+      <w:bookmarkStart w:id="53023" w:name="kapitel_18"/>
       <w:pPr>
         <w:pStyle w:val="Heading1"/>
       </w:pPr>
       <w:r>
         <w:t>Der Anruf</w:t>
       </w:r>
-      <w:bookmarkEnd w:id="44614"/>
+      <w:bookmarkEnd w:id="53023"/>
     </w:p>
     <w:p>
       <w:pPr>
@@ -27241,14 +27241,14 @@
       </w:r>
     </w:p>
     <w:p>
-      <w:bookmarkStart w:id="61595" w:name="kapitel_19"/>
+      <w:bookmarkStart w:id="88610" w:name="kapitel_19"/>
       <w:pPr>
         <w:pStyle w:val="Heading1"/>
       </w:pPr>
       <w:r>
         <w:t>Bald</w:t>
       </w:r>
-      <w:bookmarkEnd w:id="61595"/>
+      <w:bookmarkEnd w:id="88610"/>
     </w:p>
     <w:p>
       <w:pPr>
@@ -29177,6 +29177,75 @@
           <w:sz w:val="22"/>
         </w:rPr>
         <w:t>Jede Bewertung hilft mir, noch mehr Abenteuer für dich zu schreiben!</w:t>
+      </w:r>
+    </w:p>
+    <w:p/>
+    <w:p>
+      <w:pPr>
+        <w:spacing w:after="160"/>
+        <w:jc w:val="center"/>
+      </w:pPr>
+      <w:r>
+        <w:rPr>
+          <w:rFonts w:ascii="Georgia" w:hAnsi="Georgia"/>
+          <w:i/>
+          <w:sz w:val="22"/>
+        </w:rPr>
+        <w:t>Einfach den Code scannen und eine Bewertung dalassen:</w:t>
+      </w:r>
+    </w:p>
+    <w:p>
+      <w:pPr>
+        <w:spacing w:after="120"/>
+        <w:jc w:val="center"/>
+      </w:pPr>
+      <w:r>
+        <w:drawing>
+          <wp:inline xmlns:a="http://schemas.openxmlformats.org/drawingml/2006/main" xmlns:pic="http://schemas.openxmlformats.org/drawingml/2006/picture">
+            <wp:extent cx="1371600" cy="1371600"/>
+            <wp:docPr id="1" name="Picture 1"/>
+            <wp:cNvGraphicFramePr>
+              <a:graphicFrameLocks noChangeAspect="1"/>
+            </wp:cNvGraphicFramePr>
+            <a:graphic>
+              <a:graphicData uri="http://schemas.openxmlformats.org/drawingml/2006/picture">
+                <pic:pic>
+                  <pic:nvPicPr>
+                    <pic:cNvPr id="0" name="qr_rezension_band2.png"/>
+                    <pic:cNvPicPr/>
+                  </pic:nvPicPr>
+                  <pic:blipFill>
+                    <a:blip r:embed="rId9"/>
+                    <a:stretch>
+                      <a:fillRect/>
+                    </a:stretch>
+                  </pic:blipFill>
+                  <pic:spPr>
+                    <a:xfrm>
+                      <a:off x="0" y="0"/>
+                      <a:ext cx="1371600" cy="1371600"/>
+                    </a:xfrm>
+                    <a:prstGeom prst="rect"/>
+                  </pic:spPr>
+                </pic:pic>
+              </a:graphicData>
+            </a:graphic>
+          </wp:inline>
+        </w:drawing>
+      </w:r>
+    </w:p>
+    <w:p>
+      <w:pPr>
+        <w:spacing w:after="200"/>
+        <w:jc w:val="center"/>
+      </w:pPr>
+      <w:r>
+        <w:rPr>
+          <w:rFonts w:ascii="Georgia" w:hAnsi="Georgia"/>
+          <w:i/>
+          <w:sz w:val="18"/>
+        </w:rPr>
+        <w:t>(Handykamera auf den Code halten – der Link öffnet sich von selbst.)</w:t>
       </w:r>
     </w:p>
     <w:p/>

</xml_diff>

<commit_message>
Band 2: QR-Code wurde abgeschnitten -- Zeilenabstand-Fix
Ursache: Der Normal-Stil hat EXAKTEN Zeilenabstand (Pt(14)). Ein Inline-Bild in
so einem Absatz wird von Word/KDP auf die Zeilenhoehe (14pt) abgeschnitten --
deshalb war statt des QR nur ein duenner Streifen sichtbar.

Fix: Bild-Absatz auf line_spacing = 1.0 (SINGLE, mitwachsend). QR rendert jetzt
voll (1,50 x 1,50 Zoll).

Ende-zu-Ende geprueft: Manuskript via LibreOffice nach PDF gerendert, QR aus der
Druckseite mit OpenCV dekodiert -> korrekte Bewertungs-URL, scannbar.

Co-Authored-By: Claude Opus 4.8 <noreply@anthropic.com>
</commit_message>
<xml_diff>
--- a/Band_2/Linear/Manuskript.docx
+++ b/Band_2/Linear/Manuskript.docx
@@ -651,14 +651,14 @@
       </w:r>
     </w:p>
     <w:p>
-      <w:bookmarkStart w:id="7973" w:name="kapitel_1"/>
+      <w:bookmarkStart w:id="33592" w:name="kapitel_1"/>
       <w:pPr>
         <w:pStyle w:val="Heading1"/>
       </w:pPr>
       <w:r>
         <w:t>Der versiegelte Brief</w:t>
       </w:r>
-      <w:bookmarkEnd w:id="7973"/>
+      <w:bookmarkEnd w:id="33592"/>
     </w:p>
     <w:p>
       <w:pPr>
@@ -2213,14 +2213,14 @@
       </w:r>
     </w:p>
     <w:p>
-      <w:bookmarkStart w:id="69870" w:name="kapitel_2"/>
+      <w:bookmarkStart w:id="82768" w:name="kapitel_2"/>
       <w:pPr>
         <w:pStyle w:val="Heading1"/>
       </w:pPr>
       <w:r>
         <w:t>Die Wahrheit über den Brunnen</w:t>
       </w:r>
-      <w:bookmarkEnd w:id="69870"/>
+      <w:bookmarkEnd w:id="82768"/>
     </w:p>
     <w:p>
       <w:pPr>
@@ -3615,14 +3615,14 @@
       </w:r>
     </w:p>
     <w:p>
-      <w:bookmarkStart w:id="60464" w:name="kapitel_3"/>
+      <w:bookmarkStart w:id="38624" w:name="kapitel_3"/>
       <w:pPr>
         <w:pStyle w:val="Heading1"/>
       </w:pPr>
       <w:r>
         <w:t>Die vermissten Kinder</w:t>
       </w:r>
-      <w:bookmarkEnd w:id="60464"/>
+      <w:bookmarkEnd w:id="38624"/>
     </w:p>
     <w:p>
       <w:pPr>
@@ -4909,14 +4909,14 @@
       </w:r>
     </w:p>
     <w:p>
-      <w:bookmarkStart w:id="30858" w:name="kapitel_4"/>
+      <w:bookmarkStart w:id="3507" w:name="kapitel_4"/>
       <w:pPr>
         <w:pStyle w:val="Heading1"/>
       </w:pPr>
       <w:r>
         <w:t>Geheimtinte</w:t>
       </w:r>
-      <w:bookmarkEnd w:id="30858"/>
+      <w:bookmarkEnd w:id="3507"/>
     </w:p>
     <w:p>
       <w:pPr>
@@ -6167,14 +6167,14 @@
       </w:r>
     </w:p>
     <w:p>
-      <w:bookmarkStart w:id="60475" w:name="kapitel_5"/>
+      <w:bookmarkStart w:id="79719" w:name="kapitel_5"/>
       <w:pPr>
         <w:pStyle w:val="Heading1"/>
       </w:pPr>
       <w:r>
         <w:t>Die Zeugin</w:t>
       </w:r>
-      <w:bookmarkEnd w:id="60475"/>
+      <w:bookmarkEnd w:id="79719"/>
     </w:p>
     <w:p>
       <w:pPr>
@@ -7412,14 +7412,14 @@
       </w:r>
     </w:p>
     <w:p>
-      <w:bookmarkStart w:id="28775" w:name="kapitel_6"/>
+      <w:bookmarkStart w:id="66297" w:name="kapitel_6"/>
       <w:pPr>
         <w:pStyle w:val="Heading1"/>
       </w:pPr>
       <w:r>
         <w:t>Zurück in den Tunnel</w:t>
       </w:r>
-      <w:bookmarkEnd w:id="28775"/>
+      <w:bookmarkEnd w:id="66297"/>
     </w:p>
     <w:p>
       <w:pPr>
@@ -8816,14 +8816,14 @@
       </w:r>
     </w:p>
     <w:p>
-      <w:bookmarkStart w:id="64736" w:name="kapitel_7"/>
+      <w:bookmarkStart w:id="36590" w:name="kapitel_7"/>
       <w:pPr>
         <w:pStyle w:val="Heading1"/>
       </w:pPr>
       <w:r>
         <w:t>Meiers Geständnis</w:t>
       </w:r>
-      <w:bookmarkEnd w:id="64736"/>
+      <w:bookmarkEnd w:id="36590"/>
     </w:p>
     <w:p>
       <w:pPr>
@@ -10207,14 +10207,14 @@
       </w:r>
     </w:p>
     <w:p>
-      <w:bookmarkStart w:id="52264" w:name="kapitel_8"/>
+      <w:bookmarkStart w:id="3233" w:name="kapitel_8"/>
       <w:pPr>
         <w:pStyle w:val="Heading1"/>
       </w:pPr>
       <w:r>
         <w:t>Das Rätsel der vier Linien</w:t>
       </w:r>
-      <w:bookmarkEnd w:id="52264"/>
+      <w:bookmarkEnd w:id="3233"/>
     </w:p>
     <w:p>
       <w:pPr>
@@ -11766,14 +11766,14 @@
       </w:r>
     </w:p>
     <w:p>
-      <w:bookmarkStart w:id="44274" w:name="kapitel_9"/>
+      <w:bookmarkStart w:id="56184" w:name="kapitel_9"/>
       <w:pPr>
         <w:pStyle w:val="Heading1"/>
       </w:pPr>
       <w:r>
         <w:t>Die Treppe</w:t>
       </w:r>
-      <w:bookmarkEnd w:id="44274"/>
+      <w:bookmarkEnd w:id="56184"/>
     </w:p>
     <w:p>
       <w:pPr>
@@ -13300,14 +13300,14 @@
       </w:r>
     </w:p>
     <w:p>
-      <w:bookmarkStart w:id="98136" w:name="kapitel_10"/>
+      <w:bookmarkStart w:id="31" w:name="kapitel_10"/>
       <w:pPr>
         <w:pStyle w:val="Heading1"/>
       </w:pPr>
       <w:r>
         <w:t>Die falsche Abzweigung</w:t>
       </w:r>
-      <w:bookmarkEnd w:id="98136"/>
+      <w:bookmarkEnd w:id="31"/>
     </w:p>
     <w:p>
       <w:pPr>
@@ -15050,14 +15050,14 @@
       </w:r>
     </w:p>
     <w:p>
-      <w:bookmarkStart w:id="8443" w:name="kapitel_11"/>
+      <w:bookmarkStart w:id="72910" w:name="kapitel_11"/>
       <w:pPr>
         <w:pStyle w:val="Heading1"/>
       </w:pPr>
       <w:r>
         <w:t>Eingesperrt</w:t>
       </w:r>
-      <w:bookmarkEnd w:id="8443"/>
+      <w:bookmarkEnd w:id="72910"/>
     </w:p>
     <w:p>
       <w:pPr>
@@ -16824,14 +16824,14 @@
       </w:r>
     </w:p>
     <w:p>
-      <w:bookmarkStart w:id="68187" w:name="kapitel_12"/>
+      <w:bookmarkStart w:id="27339" w:name="kapitel_12"/>
       <w:pPr>
         <w:pStyle w:val="Heading1"/>
       </w:pPr>
       <w:r>
         <w:t>Die Quelle</w:t>
       </w:r>
-      <w:bookmarkEnd w:id="68187"/>
+      <w:bookmarkEnd w:id="27339"/>
     </w:p>
     <w:p>
       <w:pPr>
@@ -18202,14 +18202,14 @@
       </w:r>
     </w:p>
     <w:p>
-      <w:bookmarkStart w:id="53095" w:name="kapitel_13"/>
+      <w:bookmarkStart w:id="21596" w:name="kapitel_13"/>
       <w:pPr>
         <w:pStyle w:val="Heading1"/>
       </w:pPr>
       <w:r>
         <w:t>Bens Plan</w:t>
       </w:r>
-      <w:bookmarkEnd w:id="53095"/>
+      <w:bookmarkEnd w:id="21596"/>
     </w:p>
     <w:p>
       <w:pPr>
@@ -19807,14 +19807,14 @@
       </w:r>
     </w:p>
     <w:p>
-      <w:bookmarkStart w:id="53942" w:name="kapitel_14"/>
+      <w:bookmarkStart w:id="16552" w:name="kapitel_14"/>
       <w:pPr>
         <w:pStyle w:val="Heading1"/>
       </w:pPr>
       <w:r>
         <w:t>Der Aufstieg</w:t>
       </w:r>
-      <w:bookmarkEnd w:id="53942"/>
+      <w:bookmarkEnd w:id="16552"/>
     </w:p>
     <w:p>
       <w:pPr>
@@ -21521,14 +21521,14 @@
       </w:r>
     </w:p>
     <w:p>
-      <w:bookmarkStart w:id="34681" w:name="kapitel_15"/>
+      <w:bookmarkStart w:id="81581" w:name="kapitel_15"/>
       <w:pPr>
         <w:pStyle w:val="Heading1"/>
       </w:pPr>
       <w:r>
         <w:t>Die Zeitkapsel</w:t>
       </w:r>
-      <w:bookmarkEnd w:id="34681"/>
+      <w:bookmarkEnd w:id="81581"/>
     </w:p>
     <w:p>
       <w:pPr>
@@ -23033,14 +23033,14 @@
       </w:r>
     </w:p>
     <w:p>
-      <w:bookmarkStart w:id="98127" w:name="kapitel_16"/>
+      <w:bookmarkStart w:id="59946" w:name="kapitel_16"/>
       <w:pPr>
         <w:pStyle w:val="Heading1"/>
       </w:pPr>
       <w:r>
         <w:t>Frau Bergmanns Tränen</w:t>
       </w:r>
-      <w:bookmarkEnd w:id="98127"/>
+      <w:bookmarkEnd w:id="59946"/>
     </w:p>
     <w:p>
       <w:pPr>
@@ -24521,14 +24521,14 @@
       </w:r>
     </w:p>
     <w:p>
-      <w:bookmarkStart w:id="54564" w:name="kapitel_17"/>
+      <w:bookmarkStart w:id="3115" w:name="kapitel_17"/>
       <w:pPr>
         <w:pStyle w:val="Heading1"/>
       </w:pPr>
       <w:r>
         <w:t>Das richtige Erbe</w:t>
       </w:r>
-      <w:bookmarkEnd w:id="54564"/>
+      <w:bookmarkEnd w:id="3115"/>
     </w:p>
     <w:p>
       <w:pPr>
@@ -25935,14 +25935,14 @@
       </w:r>
     </w:p>
     <w:p>
-      <w:bookmarkStart w:id="53023" w:name="kapitel_18"/>
+      <w:bookmarkStart w:id="82247" w:name="kapitel_18"/>
       <w:pPr>
         <w:pStyle w:val="Heading1"/>
       </w:pPr>
       <w:r>
         <w:t>Der Anruf</w:t>
       </w:r>
-      <w:bookmarkEnd w:id="53023"/>
+      <w:bookmarkEnd w:id="82247"/>
     </w:p>
     <w:p>
       <w:pPr>
@@ -27241,14 +27241,14 @@
       </w:r>
     </w:p>
     <w:p>
-      <w:bookmarkStart w:id="88610" w:name="kapitel_19"/>
+      <w:bookmarkStart w:id="97108" w:name="kapitel_19"/>
       <w:pPr>
         <w:pStyle w:val="Heading1"/>
       </w:pPr>
       <w:r>
         <w:t>Bald</w:t>
       </w:r>
-      <w:bookmarkEnd w:id="88610"/>
+      <w:bookmarkEnd w:id="97108"/>
     </w:p>
     <w:p>
       <w:pPr>
@@ -29196,7 +29196,7 @@
     </w:p>
     <w:p>
       <w:pPr>
-        <w:spacing w:after="120"/>
+        <w:spacing w:line="240" w:lineRule="auto" w:before="120" w:after="120"/>
         <w:jc w:val="center"/>
       </w:pPr>
       <w:r>

</xml_diff>

<commit_message>
Band 2: Band-3-Vorschau als echte Leseprobe (Text aus dem geschriebenen Band 3)
Statt erfundenem Atmo-Teaser liest die Vorschau jetzt den ECHTEN Anfang von
Band 3, Kapitel 1 direkt aus dem Kapitel-File ein (bis zum Cliffhanger
"Beide zeigten zum Wald.") und rendert ihn als Buch-Leseprobe. Bleibt damit
automatisch synchron mit dem geschriebenen Band 3.

- Kopf: LESEPROBE / Band 3 / Die zweite Quelle, Kapitelkopf "KAPITEL 1 -
  Das zweite X", dann echter Fliesstext (Kursiv-Erkennung, Szenentrenner)
- " -- " -> " — " (sauberer Gedankenstrich in der Leseprobe)
- CTA neutral ("Wie es weitergeht, liest du in ...") statt "Erscheint bald!"
- Via LibreOffice gerendert + geprueft

Co-Authored-By: Claude Opus 4.8 <noreply@anthropic.com>
</commit_message>
<xml_diff>
--- a/Band_2/Linear/Manuskript.docx
+++ b/Band_2/Linear/Manuskript.docx
@@ -651,14 +651,14 @@
       </w:r>
     </w:p>
     <w:p>
-      <w:bookmarkStart w:id="33592" w:name="kapitel_1"/>
+      <w:bookmarkStart w:id="19605" w:name="kapitel_1"/>
       <w:pPr>
         <w:pStyle w:val="Heading1"/>
       </w:pPr>
       <w:r>
         <w:t>Der versiegelte Brief</w:t>
       </w:r>
-      <w:bookmarkEnd w:id="33592"/>
+      <w:bookmarkEnd w:id="19605"/>
     </w:p>
     <w:p>
       <w:pPr>
@@ -2213,14 +2213,14 @@
       </w:r>
     </w:p>
     <w:p>
-      <w:bookmarkStart w:id="82768" w:name="kapitel_2"/>
+      <w:bookmarkStart w:id="85827" w:name="kapitel_2"/>
       <w:pPr>
         <w:pStyle w:val="Heading1"/>
       </w:pPr>
       <w:r>
         <w:t>Die Wahrheit über den Brunnen</w:t>
       </w:r>
-      <w:bookmarkEnd w:id="82768"/>
+      <w:bookmarkEnd w:id="85827"/>
     </w:p>
     <w:p>
       <w:pPr>
@@ -3615,14 +3615,14 @@
       </w:r>
     </w:p>
     <w:p>
-      <w:bookmarkStart w:id="38624" w:name="kapitel_3"/>
+      <w:bookmarkStart w:id="82873" w:name="kapitel_3"/>
       <w:pPr>
         <w:pStyle w:val="Heading1"/>
       </w:pPr>
       <w:r>
         <w:t>Die vermissten Kinder</w:t>
       </w:r>
-      <w:bookmarkEnd w:id="38624"/>
+      <w:bookmarkEnd w:id="82873"/>
     </w:p>
     <w:p>
       <w:pPr>
@@ -4909,14 +4909,14 @@
       </w:r>
     </w:p>
     <w:p>
-      <w:bookmarkStart w:id="3507" w:name="kapitel_4"/>
+      <w:bookmarkStart w:id="65228" w:name="kapitel_4"/>
       <w:pPr>
         <w:pStyle w:val="Heading1"/>
       </w:pPr>
       <w:r>
         <w:t>Geheimtinte</w:t>
       </w:r>
-      <w:bookmarkEnd w:id="3507"/>
+      <w:bookmarkEnd w:id="65228"/>
     </w:p>
     <w:p>
       <w:pPr>
@@ -6167,14 +6167,14 @@
       </w:r>
     </w:p>
     <w:p>
-      <w:bookmarkStart w:id="79719" w:name="kapitel_5"/>
+      <w:bookmarkStart w:id="86434" w:name="kapitel_5"/>
       <w:pPr>
         <w:pStyle w:val="Heading1"/>
       </w:pPr>
       <w:r>
         <w:t>Die Zeugin</w:t>
       </w:r>
-      <w:bookmarkEnd w:id="79719"/>
+      <w:bookmarkEnd w:id="86434"/>
     </w:p>
     <w:p>
       <w:pPr>
@@ -7412,14 +7412,14 @@
       </w:r>
     </w:p>
     <w:p>
-      <w:bookmarkStart w:id="66297" w:name="kapitel_6"/>
+      <w:bookmarkStart w:id="36676" w:name="kapitel_6"/>
       <w:pPr>
         <w:pStyle w:val="Heading1"/>
       </w:pPr>
       <w:r>
         <w:t>Zurück in den Tunnel</w:t>
       </w:r>
-      <w:bookmarkEnd w:id="66297"/>
+      <w:bookmarkEnd w:id="36676"/>
     </w:p>
     <w:p>
       <w:pPr>
@@ -8816,14 +8816,14 @@
       </w:r>
     </w:p>
     <w:p>
-      <w:bookmarkStart w:id="36590" w:name="kapitel_7"/>
+      <w:bookmarkStart w:id="48948" w:name="kapitel_7"/>
       <w:pPr>
         <w:pStyle w:val="Heading1"/>
       </w:pPr>
       <w:r>
         <w:t>Meiers Geständnis</w:t>
       </w:r>
-      <w:bookmarkEnd w:id="36590"/>
+      <w:bookmarkEnd w:id="48948"/>
     </w:p>
     <w:p>
       <w:pPr>
@@ -10207,14 +10207,14 @@
       </w:r>
     </w:p>
     <w:p>
-      <w:bookmarkStart w:id="3233" w:name="kapitel_8"/>
+      <w:bookmarkStart w:id="53959" w:name="kapitel_8"/>
       <w:pPr>
         <w:pStyle w:val="Heading1"/>
       </w:pPr>
       <w:r>
         <w:t>Das Rätsel der vier Linien</w:t>
       </w:r>
-      <w:bookmarkEnd w:id="3233"/>
+      <w:bookmarkEnd w:id="53959"/>
     </w:p>
     <w:p>
       <w:pPr>
@@ -11766,14 +11766,14 @@
       </w:r>
     </w:p>
     <w:p>
-      <w:bookmarkStart w:id="56184" w:name="kapitel_9"/>
+      <w:bookmarkStart w:id="60070" w:name="kapitel_9"/>
       <w:pPr>
         <w:pStyle w:val="Heading1"/>
       </w:pPr>
       <w:r>
         <w:t>Die Treppe</w:t>
       </w:r>
-      <w:bookmarkEnd w:id="56184"/>
+      <w:bookmarkEnd w:id="60070"/>
     </w:p>
     <w:p>
       <w:pPr>
@@ -13300,14 +13300,14 @@
       </w:r>
     </w:p>
     <w:p>
-      <w:bookmarkStart w:id="31" w:name="kapitel_10"/>
+      <w:bookmarkStart w:id="80680" w:name="kapitel_10"/>
       <w:pPr>
         <w:pStyle w:val="Heading1"/>
       </w:pPr>
       <w:r>
         <w:t>Die falsche Abzweigung</w:t>
       </w:r>
-      <w:bookmarkEnd w:id="31"/>
+      <w:bookmarkEnd w:id="80680"/>
     </w:p>
     <w:p>
       <w:pPr>
@@ -15050,14 +15050,14 @@
       </w:r>
     </w:p>
     <w:p>
-      <w:bookmarkStart w:id="72910" w:name="kapitel_11"/>
+      <w:bookmarkStart w:id="67040" w:name="kapitel_11"/>
       <w:pPr>
         <w:pStyle w:val="Heading1"/>
       </w:pPr>
       <w:r>
         <w:t>Eingesperrt</w:t>
       </w:r>
-      <w:bookmarkEnd w:id="72910"/>
+      <w:bookmarkEnd w:id="67040"/>
     </w:p>
     <w:p>
       <w:pPr>
@@ -16824,14 +16824,14 @@
       </w:r>
     </w:p>
     <w:p>
-      <w:bookmarkStart w:id="27339" w:name="kapitel_12"/>
+      <w:bookmarkStart w:id="30248" w:name="kapitel_12"/>
       <w:pPr>
         <w:pStyle w:val="Heading1"/>
       </w:pPr>
       <w:r>
         <w:t>Die Quelle</w:t>
       </w:r>
-      <w:bookmarkEnd w:id="27339"/>
+      <w:bookmarkEnd w:id="30248"/>
     </w:p>
     <w:p>
       <w:pPr>
@@ -18202,14 +18202,14 @@
       </w:r>
     </w:p>
     <w:p>
-      <w:bookmarkStart w:id="21596" w:name="kapitel_13"/>
+      <w:bookmarkStart w:id="25206" w:name="kapitel_13"/>
       <w:pPr>
         <w:pStyle w:val="Heading1"/>
       </w:pPr>
       <w:r>
         <w:t>Bens Plan</w:t>
       </w:r>
-      <w:bookmarkEnd w:id="21596"/>
+      <w:bookmarkEnd w:id="25206"/>
     </w:p>
     <w:p>
       <w:pPr>
@@ -19807,14 +19807,14 @@
       </w:r>
     </w:p>
     <w:p>
-      <w:bookmarkStart w:id="16552" w:name="kapitel_14"/>
+      <w:bookmarkStart w:id="72206" w:name="kapitel_14"/>
       <w:pPr>
         <w:pStyle w:val="Heading1"/>
       </w:pPr>
       <w:r>
         <w:t>Der Aufstieg</w:t>
       </w:r>
-      <w:bookmarkEnd w:id="16552"/>
+      <w:bookmarkEnd w:id="72206"/>
     </w:p>
     <w:p>
       <w:pPr>
@@ -21521,14 +21521,14 @@
       </w:r>
     </w:p>
     <w:p>
-      <w:bookmarkStart w:id="81581" w:name="kapitel_15"/>
+      <w:bookmarkStart w:id="94151" w:name="kapitel_15"/>
       <w:pPr>
         <w:pStyle w:val="Heading1"/>
       </w:pPr>
       <w:r>
         <w:t>Die Zeitkapsel</w:t>
       </w:r>
-      <w:bookmarkEnd w:id="81581"/>
+      <w:bookmarkEnd w:id="94151"/>
     </w:p>
     <w:p>
       <w:pPr>
@@ -23033,14 +23033,14 @@
       </w:r>
     </w:p>
     <w:p>
-      <w:bookmarkStart w:id="59946" w:name="kapitel_16"/>
+      <w:bookmarkStart w:id="73860" w:name="kapitel_16"/>
       <w:pPr>
         <w:pStyle w:val="Heading1"/>
       </w:pPr>
       <w:r>
         <w:t>Frau Bergmanns Tränen</w:t>
       </w:r>
-      <w:bookmarkEnd w:id="59946"/>
+      <w:bookmarkEnd w:id="73860"/>
     </w:p>
     <w:p>
       <w:pPr>
@@ -24521,14 +24521,14 @@
       </w:r>
     </w:p>
     <w:p>
-      <w:bookmarkStart w:id="3115" w:name="kapitel_17"/>
+      <w:bookmarkStart w:id="34831" w:name="kapitel_17"/>
       <w:pPr>
         <w:pStyle w:val="Heading1"/>
       </w:pPr>
       <w:r>
         <w:t>Das richtige Erbe</w:t>
       </w:r>
-      <w:bookmarkEnd w:id="3115"/>
+      <w:bookmarkEnd w:id="34831"/>
     </w:p>
     <w:p>
       <w:pPr>
@@ -25935,14 +25935,14 @@
       </w:r>
     </w:p>
     <w:p>
-      <w:bookmarkStart w:id="82247" w:name="kapitel_18"/>
+      <w:bookmarkStart w:id="53858" w:name="kapitel_18"/>
       <w:pPr>
         <w:pStyle w:val="Heading1"/>
       </w:pPr>
       <w:r>
         <w:t>Der Anruf</w:t>
       </w:r>
-      <w:bookmarkEnd w:id="82247"/>
+      <w:bookmarkEnd w:id="53858"/>
     </w:p>
     <w:p>
       <w:pPr>
@@ -27241,14 +27241,14 @@
       </w:r>
     </w:p>
     <w:p>
-      <w:bookmarkStart w:id="97108" w:name="kapitel_19"/>
+      <w:bookmarkStart w:id="41503" w:name="kapitel_19"/>
       <w:pPr>
         <w:pStyle w:val="Heading1"/>
       </w:pPr>
       <w:r>
         <w:t>Bald</w:t>
       </w:r>
-      <w:bookmarkEnd w:id="97108"/>
+      <w:bookmarkEnd w:id="41503"/>
     </w:p>
     <w:p>
       <w:pPr>
@@ -29292,8 +29292,601 @@
           <w:rFonts w:ascii="Georgia" w:hAnsi="Georgia"/>
           <w:color w:val="646464"/>
           <w:sz w:val="22"/>
-        </w:rPr>
-        <w:t>Vorschau</w:t>
+          <w:spacing w:val="52"/>
+        </w:rPr>
+        <w:t>LESEPROBE</w:t>
+      </w:r>
+    </w:p>
+    <w:p>
+      <w:pPr>
+        <w:spacing w:after="40"/>
+        <w:jc w:val="center"/>
+      </w:pPr>
+      <w:r>
+        <w:rPr>
+          <w:rFonts w:ascii="Georgia" w:hAnsi="Georgia"/>
+          <w:sz w:val="26"/>
+        </w:rPr>
+        <w:t>Die Herrenhaus-Detektive, Band 3</w:t>
+      </w:r>
+    </w:p>
+    <w:p>
+      <w:pPr>
+        <w:spacing w:after="360"/>
+        <w:jc w:val="center"/>
+      </w:pPr>
+      <w:r>
+        <w:rPr>
+          <w:rFonts w:ascii="Georgia" w:hAnsi="Georgia"/>
+          <w:b/>
+          <w:sz w:val="36"/>
+        </w:rPr>
+        <w:t>Die zweite Quelle</w:t>
+      </w:r>
+    </w:p>
+    <w:p>
+      <w:pPr>
+        <w:spacing w:after="120"/>
+        <w:jc w:val="center"/>
+      </w:pPr>
+      <w:r>
+        <w:rPr>
+          <w:rFonts w:ascii="Georgia" w:hAnsi="Georgia"/>
+          <w:color w:val="5A5A5A"/>
+          <w:sz w:val="22"/>
+          <w:spacing w:val="52"/>
+        </w:rPr>
+        <w:t>KAPITEL 1</w:t>
+      </w:r>
+    </w:p>
+    <w:p>
+      <w:pPr>
+        <w:spacing w:after="320"/>
+        <w:jc w:val="center"/>
+      </w:pPr>
+      <w:r>
+        <w:rPr>
+          <w:rFonts w:ascii="Georgia" w:hAnsi="Georgia"/>
+          <w:b/>
+          <w:sz w:val="30"/>
+        </w:rPr>
+        <w:t>Das zweite X</w:t>
+      </w:r>
+    </w:p>
+    <w:p>
+      <w:pPr>
+        <w:spacing w:before="80" w:after="0"/>
+      </w:pPr>
+      <w:r>
+        <w:rPr>
+          <w:rFonts w:ascii="Georgia" w:hAnsi="Georgia"/>
+          <w:sz w:val="22"/>
+        </w:rPr>
+        <w:t>Jonas rannte über den Marktplatz und stoppte am Brunnen.</w:t>
+      </w:r>
+    </w:p>
+    <w:p>
+      <w:pPr>
+        <w:spacing w:before="80" w:after="0"/>
+      </w:pPr>
+      <w:r>
+        <w:rPr>
+          <w:rFonts w:ascii="Georgia" w:hAnsi="Georgia"/>
+          <w:sz w:val="22"/>
+        </w:rPr>
+        <w:t>Es war einer der letzten warmen Tage im Spätsommer. Die Morgensonne wärmte schon. Auf der alten Eiche am Platz färbten sich die ersten Blätter gelb. Bald würde der Herbst kommen.</w:t>
+      </w:r>
+    </w:p>
+    <w:p>
+      <w:pPr>
+        <w:spacing w:before="80" w:after="0"/>
+      </w:pPr>
+      <w:r>
+        <w:rPr>
+          <w:rFonts w:ascii="Georgia" w:hAnsi="Georgia"/>
+          <w:sz w:val="22"/>
+        </w:rPr>
+        <w:t xml:space="preserve">Die Gedenktafel glänzte in der Sonne. </w:t>
+      </w:r>
+      <w:r>
+        <w:rPr>
+          <w:rFonts w:ascii="Georgia" w:hAnsi="Georgia"/>
+          <w:i/>
+          <w:sz w:val="22"/>
+        </w:rPr>
+        <w:t>Eichenhain — Gegründet an der Heilquelle — Seit 1712.</w:t>
+      </w:r>
+      <w:r>
+        <w:rPr>
+          <w:rFonts w:ascii="Georgia" w:hAnsi="Georgia"/>
+          <w:sz w:val="22"/>
+        </w:rPr>
+      </w:r>
+    </w:p>
+    <w:p>
+      <w:pPr>
+        <w:spacing w:before="80" w:after="0"/>
+      </w:pPr>
+      <w:r>
+        <w:rPr>
+          <w:rFonts w:ascii="Georgia" w:hAnsi="Georgia"/>
+          <w:sz w:val="22"/>
+        </w:rPr>
+        <w:t>Drei Wochen war das jetzt her. Der Brunnen, die Gänge, die Wahrheit.</w:t>
+      </w:r>
+    </w:p>
+    <w:p>
+      <w:pPr>
+        <w:spacing w:before="80" w:after="0"/>
+      </w:pPr>
+      <w:r>
+        <w:rPr>
+          <w:rFonts w:ascii="Georgia" w:hAnsi="Georgia"/>
+          <w:sz w:val="22"/>
+        </w:rPr>
+        <w:t>Dann sah er den Riss.</w:t>
+      </w:r>
+    </w:p>
+    <w:p>
+      <w:pPr>
+        <w:spacing w:before="80" w:after="0"/>
+      </w:pPr>
+      <w:r>
+        <w:rPr>
+          <w:rFonts w:ascii="Georgia" w:hAnsi="Georgia"/>
+          <w:sz w:val="22"/>
+        </w:rPr>
+        <w:t>Dünn wie ein Faden lief er über das Pflaster. Gestern war er noch nicht da gewesen.</w:t>
+      </w:r>
+    </w:p>
+    <w:p>
+      <w:pPr>
+        <w:spacing w:before="80" w:after="0"/>
+      </w:pPr>
+      <w:r>
+        <w:rPr>
+          <w:rFonts w:ascii="Georgia" w:hAnsi="Georgia"/>
+          <w:sz w:val="22"/>
+        </w:rPr>
+        <w:t>Jonas ging in die Hocke und strich darüber. Kühl. Und feucht.</w:t>
+      </w:r>
+    </w:p>
+    <w:p>
+      <w:pPr>
+        <w:spacing w:before="80" w:after="0"/>
+      </w:pPr>
+      <w:r>
+        <w:rPr>
+          <w:rFonts w:ascii="Georgia" w:hAnsi="Georgia"/>
+          <w:sz w:val="22"/>
+        </w:rPr>
+        <w:t>„Seltsam", murmelte er.</w:t>
+      </w:r>
+    </w:p>
+    <w:p>
+      <w:pPr>
+        <w:spacing w:before="80" w:after="0"/>
+      </w:pPr>
+      <w:r>
+        <w:rPr>
+          <w:rFonts w:ascii="Georgia" w:hAnsi="Georgia"/>
+          <w:sz w:val="22"/>
+        </w:rPr>
+        <w:t>„Was ist seltsam?"</w:t>
+      </w:r>
+    </w:p>
+    <w:p>
+      <w:pPr>
+        <w:spacing w:before="80" w:after="0"/>
+      </w:pPr>
+      <w:r>
+        <w:rPr>
+          <w:rFonts w:ascii="Georgia" w:hAnsi="Georgia"/>
+          <w:sz w:val="22"/>
+        </w:rPr>
+        <w:t>Frau Schneider stand mit ihrem Korb neben ihm. Jonas zeigte auf den Riss.</w:t>
+      </w:r>
+    </w:p>
+    <w:p>
+      <w:pPr>
+        <w:spacing w:before="80" w:after="0"/>
+      </w:pPr>
+      <w:r>
+        <w:rPr>
+          <w:rFonts w:ascii="Georgia" w:hAnsi="Georgia"/>
+          <w:sz w:val="22"/>
+        </w:rPr>
+        <w:t>„Ach, das." Sie winkte ab. „Alte Steine arbeiten, mein Junge. Der Steinleger kommt morgen."</w:t>
+      </w:r>
+    </w:p>
+    <w:p>
+      <w:pPr>
+        <w:spacing w:before="80" w:after="0"/>
+      </w:pPr>
+      <w:r>
+        <w:rPr>
+          <w:rFonts w:ascii="Georgia" w:hAnsi="Georgia"/>
+          <w:sz w:val="22"/>
+        </w:rPr>
+        <w:t>Sie ging weiter.</w:t>
+      </w:r>
+    </w:p>
+    <w:p>
+      <w:pPr>
+        <w:spacing w:before="80" w:after="0"/>
+      </w:pPr>
+      <w:r>
+        <w:rPr>
+          <w:rFonts w:ascii="Georgia" w:hAnsi="Georgia"/>
+          <w:sz w:val="22"/>
+        </w:rPr>
+        <w:t>Aber Jonas blieb in der Hocke. Der Riss war feucht. Er fuhr noch einmal mit dem Finger darüber. Kleine Wassertropfen blieben daran hängen.</w:t>
+      </w:r>
+    </w:p>
+    <w:p>
+      <w:pPr>
+        <w:spacing w:before="80" w:after="0"/>
+      </w:pPr>
+      <w:r>
+        <w:rPr>
+          <w:rFonts w:ascii="Georgia" w:hAnsi="Georgia"/>
+          <w:sz w:val="22"/>
+        </w:rPr>
+        <w:t>Und es hatte seit Tagen nicht geregnet. Die Sonne schien. Der Boden war trocken. Nur dieser eine Riss war nass.</w:t>
+      </w:r>
+    </w:p>
+    <w:p>
+      <w:pPr>
+        <w:spacing w:before="80" w:after="0"/>
+      </w:pPr>
+      <w:r>
+        <w:rPr>
+          <w:rFonts w:ascii="Georgia" w:hAnsi="Georgia"/>
+          <w:sz w:val="22"/>
+        </w:rPr>
+        <w:t>Woher kam das Wasser?</w:t>
+      </w:r>
+    </w:p>
+    <w:p>
+      <w:pPr>
+        <w:spacing w:before="80" w:after="0"/>
+      </w:pPr>
+      <w:r>
+        <w:rPr>
+          <w:rFonts w:ascii="Georgia" w:hAnsi="Georgia"/>
+          <w:sz w:val="22"/>
+        </w:rPr>
+        <w:t>Jonas wusste es nicht. Aber irgendetwas daran gefiel ihm gar nicht.</w:t>
+      </w:r>
+    </w:p>
+    <w:p>
+      <w:pPr>
+        <w:spacing w:before="120" w:after="120"/>
+        <w:jc w:val="center"/>
+      </w:pPr>
+      <w:r>
+        <w:rPr>
+          <w:rFonts w:ascii="Georgia" w:hAnsi="Georgia"/>
+          <w:sz w:val="22"/>
+        </w:rPr>
+        <w:t>* * *</w:t>
+      </w:r>
+    </w:p>
+    <w:p>
+      <w:pPr>
+        <w:spacing w:before="80" w:after="0"/>
+      </w:pPr>
+      <w:r>
+        <w:rPr>
+          <w:rFonts w:ascii="Georgia" w:hAnsi="Georgia"/>
+          <w:sz w:val="22"/>
+        </w:rPr>
+        <w:t>„Jonas!"</w:t>
+      </w:r>
+    </w:p>
+    <w:p>
+      <w:pPr>
+        <w:spacing w:before="80" w:after="0"/>
+      </w:pPr>
+      <w:r>
+        <w:rPr>
+          <w:rFonts w:ascii="Georgia" w:hAnsi="Georgia"/>
+          <w:sz w:val="22"/>
+        </w:rPr>
+        <w:t>Mila kam über den Platz gerannt. Ben trottete hinter ihr her. Er hatte ein Brötchen in der Hand.</w:t>
+      </w:r>
+    </w:p>
+    <w:p>
+      <w:pPr>
+        <w:spacing w:before="80" w:after="0"/>
+      </w:pPr>
+      <w:r>
+        <w:rPr>
+          <w:rFonts w:ascii="Georgia" w:hAnsi="Georgia"/>
+          <w:sz w:val="22"/>
+        </w:rPr>
+        <w:t>„Da bist du ja", sagte Mila. „Hast du sie dabei?"</w:t>
+      </w:r>
+    </w:p>
+    <w:p>
+      <w:pPr>
+        <w:spacing w:before="80" w:after="0"/>
+      </w:pPr>
+      <w:r>
+        <w:rPr>
+          <w:rFonts w:ascii="Georgia" w:hAnsi="Georgia"/>
+          <w:sz w:val="22"/>
+        </w:rPr>
+        <w:t>Jonas stand auf. Er klopfte auf seinen Rucksack. „Natürlich hab ich sie dabei."</w:t>
+      </w:r>
+    </w:p>
+    <w:p>
+      <w:pPr>
+        <w:spacing w:before="80" w:after="0"/>
+      </w:pPr>
+      <w:r>
+        <w:rPr>
+          <w:rFonts w:ascii="Georgia" w:hAnsi="Georgia"/>
+          <w:sz w:val="22"/>
+        </w:rPr>
+        <w:t>„Dann zeig sie."</w:t>
+      </w:r>
+    </w:p>
+    <w:p>
+      <w:pPr>
+        <w:spacing w:before="80" w:after="0"/>
+      </w:pPr>
+      <w:r>
+        <w:rPr>
+          <w:rFonts w:ascii="Georgia" w:hAnsi="Georgia"/>
+          <w:sz w:val="22"/>
+        </w:rPr>
+        <w:t>Ben biss in sein Brötchen. „Können wir das nicht beim Frühstück machen?" Er kaute. „Ich denke besser, wenn ich esse."</w:t>
+      </w:r>
+    </w:p>
+    <w:p>
+      <w:pPr>
+        <w:spacing w:before="80" w:after="0"/>
+      </w:pPr>
+      <w:r>
+        <w:rPr>
+          <w:rFonts w:ascii="Georgia" w:hAnsi="Georgia"/>
+          <w:sz w:val="22"/>
+        </w:rPr>
+        <w:t>„Du isst immer", sagte Mila.</w:t>
+      </w:r>
+    </w:p>
+    <w:p>
+      <w:pPr>
+        <w:spacing w:before="80" w:after="0"/>
+      </w:pPr>
+      <w:r>
+        <w:rPr>
+          <w:rFonts w:ascii="Georgia" w:hAnsi="Georgia"/>
+          <w:sz w:val="22"/>
+        </w:rPr>
+        <w:t>„Eben. Darum denke ich immer gut."</w:t>
+      </w:r>
+    </w:p>
+    <w:p>
+      <w:pPr>
+        <w:spacing w:before="80" w:after="0"/>
+      </w:pPr>
+      <w:r>
+        <w:rPr>
+          <w:rFonts w:ascii="Georgia" w:hAnsi="Georgia"/>
+          <w:sz w:val="22"/>
+        </w:rPr>
+        <w:t>Mila verdrehte die Augen.</w:t>
+      </w:r>
+    </w:p>
+    <w:p>
+      <w:pPr>
+        <w:spacing w:before="80" w:after="0"/>
+      </w:pPr>
+      <w:r>
+        <w:rPr>
+          <w:rFonts w:ascii="Georgia" w:hAnsi="Georgia"/>
+          <w:sz w:val="22"/>
+        </w:rPr>
+        <w:t>Sie setzten sich auf den Brunnenrand. Jonas öffnete den Rucksack. Er zog die Karte heraus.</w:t>
+      </w:r>
+    </w:p>
+    <w:p>
+      <w:pPr>
+        <w:spacing w:before="80" w:after="0"/>
+      </w:pPr>
+      <w:r>
+        <w:rPr>
+          <w:rFonts w:ascii="Georgia" w:hAnsi="Georgia"/>
+          <w:sz w:val="22"/>
+        </w:rPr>
+        <w:t>Vorsichtig. Das Papier war alt und braun.</w:t>
+      </w:r>
+    </w:p>
+    <w:p>
+      <w:pPr>
+        <w:spacing w:before="120" w:after="120"/>
+        <w:jc w:val="center"/>
+      </w:pPr>
+      <w:r>
+        <w:rPr>
+          <w:rFonts w:ascii="Georgia" w:hAnsi="Georgia"/>
+          <w:sz w:val="22"/>
+        </w:rPr>
+        <w:t>* * *</w:t>
+      </w:r>
+    </w:p>
+    <w:p>
+      <w:pPr>
+        <w:spacing w:before="80" w:after="0"/>
+      </w:pPr>
+      <w:r>
+        <w:rPr>
+          <w:rFonts w:ascii="Georgia" w:hAnsi="Georgia"/>
+          <w:sz w:val="22"/>
+        </w:rPr>
+        <w:t>Die Karte knisterte.</w:t>
+      </w:r>
+    </w:p>
+    <w:p>
+      <w:pPr>
+        <w:spacing w:before="80" w:after="0"/>
+      </w:pPr>
+      <w:r>
+        <w:rPr>
+          <w:rFonts w:ascii="Georgia" w:hAnsi="Georgia"/>
+          <w:sz w:val="22"/>
+        </w:rPr>
+        <w:t>Sie breiteten sie vorsichtig auf den Knien aus. Drei Köpfe beugten sich darüber.</w:t>
+      </w:r>
+    </w:p>
+    <w:p>
+      <w:pPr>
+        <w:spacing w:before="80" w:after="0"/>
+      </w:pPr>
+      <w:r>
+        <w:rPr>
+          <w:rFonts w:ascii="Georgia" w:hAnsi="Georgia"/>
+          <w:sz w:val="22"/>
+        </w:rPr>
+        <w:t>Es war eine besondere Karte. Eine alte Geheimtinte-Karte. Sie hatten sie bei ihrem letzten Abenteuer gefunden, tief unter dem Brunnen, in einer Schatzkammer aus Stein. Lange war sie nur ein leeres Blatt gewesen. Bis sie das Geheimnis entdeckt hatten: Hielt man sie über eine Kerze, erschien die Schrift.</w:t>
+      </w:r>
+    </w:p>
+    <w:p>
+      <w:pPr>
+        <w:spacing w:before="80" w:after="0"/>
+      </w:pPr>
+      <w:r>
+        <w:rPr>
+          <w:rFonts w:ascii="Georgia" w:hAnsi="Georgia"/>
+          <w:sz w:val="22"/>
+        </w:rPr>
+        <w:t>Jonas kannte jede Linie darauf. Fast jede.</w:t>
+      </w:r>
+    </w:p>
+    <w:p>
+      <w:pPr>
+        <w:spacing w:before="80" w:after="0"/>
+      </w:pPr>
+      <w:r>
+        <w:rPr>
+          <w:rFonts w:ascii="Georgia" w:hAnsi="Georgia"/>
+          <w:sz w:val="22"/>
+        </w:rPr>
+        <w:t>Da war das Dorf. Der Brunnen. Die dünnen Linien der alten Gänge unter Eichenhain.</w:t>
+      </w:r>
+    </w:p>
+    <w:p>
+      <w:pPr>
+        <w:spacing w:before="80" w:after="0"/>
+      </w:pPr>
+      <w:r>
+        <w:rPr>
+          <w:rFonts w:ascii="Georgia" w:hAnsi="Georgia"/>
+          <w:sz w:val="22"/>
+        </w:rPr>
+        <w:t>Und am rechten Rand: der Wald.</w:t>
+      </w:r>
+    </w:p>
+    <w:p>
+      <w:pPr>
+        <w:spacing w:before="80" w:after="0"/>
+      </w:pPr>
+      <w:r>
+        <w:rPr>
+          <w:rFonts w:ascii="Georgia" w:hAnsi="Georgia"/>
+          <w:sz w:val="22"/>
+        </w:rPr>
+        <w:t>„Da", sagte Jonas. Er tippte auf eine Stelle.</w:t>
+      </w:r>
+    </w:p>
+    <w:p>
+      <w:pPr>
+        <w:spacing w:before="80" w:after="0"/>
+      </w:pPr>
+      <w:r>
+        <w:rPr>
+          <w:rFonts w:ascii="Georgia" w:hAnsi="Georgia"/>
+          <w:sz w:val="22"/>
+        </w:rPr>
+        <w:t>Mitten im Wald stand ein X. Ein zweites X. Eine dünne Linie führte vom Dorf dorthin.</w:t>
+      </w:r>
+    </w:p>
+    <w:p>
+      <w:pPr>
+        <w:spacing w:before="80" w:after="0"/>
+      </w:pPr>
+      <w:r>
+        <w:rPr>
+          <w:rFonts w:ascii="Georgia" w:hAnsi="Georgia"/>
+          <w:sz w:val="22"/>
+        </w:rPr>
+        <w:t>Mila fuhr die Linie mit dem Finger nach. Sie begann am Brunnen. Lief über den Marktplatz. Aus dem Dorf hinaus.</w:t>
+      </w:r>
+    </w:p>
+    <w:p>
+      <w:pPr>
+        <w:spacing w:before="80" w:after="0"/>
+      </w:pPr>
+      <w:r>
+        <w:rPr>
+          <w:rFonts w:ascii="Georgia" w:hAnsi="Georgia"/>
+          <w:sz w:val="22"/>
+        </w:rPr>
+        <w:t>„Schau mal", sagte sie. „Die Linie fängt genau hier an. Am Brunnen."</w:t>
+      </w:r>
+    </w:p>
+    <w:p>
+      <w:pPr>
+        <w:spacing w:before="80" w:after="0"/>
+      </w:pPr>
+      <w:r>
+        <w:rPr>
+          <w:rFonts w:ascii="Georgia" w:hAnsi="Georgia"/>
+          <w:sz w:val="22"/>
+        </w:rPr>
+        <w:t>Jonas beugte sich vor. Sie hatte recht.</w:t>
+      </w:r>
+    </w:p>
+    <w:p>
+      <w:pPr>
+        <w:spacing w:before="80" w:after="0"/>
+      </w:pPr>
+      <w:r>
+        <w:rPr>
+          <w:rFonts w:ascii="Georgia" w:hAnsi="Georgia"/>
+          <w:sz w:val="22"/>
+        </w:rPr>
+        <w:t>Die Linie und der Riss. Beide am Brunnen. Beide zeigten zum Wald.</w:t>
+      </w:r>
+    </w:p>
+    <w:p>
+      <w:pPr>
+        <w:spacing w:before="280" w:after="280"/>
+        <w:jc w:val="center"/>
+      </w:pPr>
+      <w:r>
+        <w:rPr>
+          <w:rFonts w:ascii="Georgia" w:hAnsi="Georgia"/>
+          <w:color w:val="787878"/>
+          <w:sz w:val="24"/>
+        </w:rPr>
+        <w:t>[ … ]</w:t>
+      </w:r>
+    </w:p>
+    <w:p>
+      <w:pPr>
+        <w:spacing w:after="40"/>
+        <w:jc w:val="center"/>
+      </w:pPr>
+      <w:r>
+        <w:rPr>
+          <w:rFonts w:ascii="Georgia" w:hAnsi="Georgia"/>
+          <w:i/>
+          <w:sz w:val="22"/>
+        </w:rPr>
+        <w:t>Wie es weitergeht, liest du in</w:t>
       </w:r>
     </w:p>
     <w:p>
@@ -29305,327 +29898,21 @@
         <w:rPr>
           <w:rFonts w:ascii="Georgia" w:hAnsi="Georgia"/>
           <w:b/>
-          <w:sz w:val="28"/>
-        </w:rPr>
-        <w:t>Die Herrenhaus-Detektive, Band 3</w:t>
-      </w:r>
-    </w:p>
-    <w:p>
-      <w:pPr>
-        <w:spacing w:after="400"/>
+          <w:sz w:val="26"/>
+        </w:rPr>
+        <w:t>Die zweite Quelle</w:t>
+      </w:r>
+    </w:p>
+    <w:p>
+      <w:pPr>
         <w:jc w:val="center"/>
       </w:pPr>
       <w:r>
         <w:rPr>
           <w:rFonts w:ascii="Georgia" w:hAnsi="Georgia"/>
-          <w:b/>
-          <w:sz w:val="32"/>
-        </w:rPr>
-        <w:t>Die zweite Quelle</w:t>
-      </w:r>
-    </w:p>
-    <w:p>
-      <w:pPr>
-        <w:spacing w:after="40"/>
-        <w:ind w:left="454" w:right="454"/>
-        <w:jc w:val="center"/>
-      </w:pPr>
-      <w:r>
-        <w:rPr>
-          <w:rFonts w:ascii="Georgia" w:hAnsi="Georgia"/>
-          <w:sz w:val="22"/>
-        </w:rPr>
-        <w:t>Der Wald steht dunkel hinter Eichenhain.</w:t>
-      </w:r>
-    </w:p>
-    <w:p>
-      <w:pPr>
-        <w:spacing w:after="40"/>
-        <w:ind w:left="454" w:right="454"/>
-        <w:jc w:val="center"/>
-      </w:pPr>
-      <w:r>
-        <w:rPr>
-          <w:rFonts w:ascii="Georgia" w:hAnsi="Georgia"/>
-          <w:sz w:val="22"/>
-        </w:rPr>
-        <w:t>Niemand geht hinein. Nicht seit …</w:t>
-      </w:r>
-    </w:p>
-    <w:p>
-      <w:pPr>
-        <w:spacing w:after="40"/>
-        <w:ind w:left="454" w:right="454"/>
-        <w:jc w:val="center"/>
-      </w:pPr>
-      <w:r>
-        <w:rPr>
-          <w:rFonts w:ascii="Georgia" w:hAnsi="Georgia"/>
-          <w:sz w:val="22"/>
-        </w:rPr>
-        <w:t>Krüger bricht den Satz ab. Jedes Mal.</w:t>
-      </w:r>
-    </w:p>
-    <w:p>
-      <w:pPr>
-        <w:spacing w:after="40"/>
-        <w:ind w:left="454" w:right="454"/>
-        <w:jc w:val="center"/>
-      </w:pPr>
-    </w:p>
-    <w:p>
-      <w:pPr>
-        <w:spacing w:after="40"/>
-        <w:ind w:left="454" w:right="454"/>
-        <w:jc w:val="center"/>
-      </w:pPr>
-      <w:r>
-        <w:rPr>
-          <w:rFonts w:ascii="Georgia" w:hAnsi="Georgia"/>
-          <w:sz w:val="22"/>
-        </w:rPr>
-        <w:t>Aber auf der Karte gibt es ein zweites X.</w:t>
-      </w:r>
-    </w:p>
-    <w:p>
-      <w:pPr>
-        <w:spacing w:after="40"/>
-        <w:ind w:left="454" w:right="454"/>
-        <w:jc w:val="center"/>
-      </w:pPr>
-      <w:r>
-        <w:rPr>
-          <w:rFonts w:ascii="Georgia" w:hAnsi="Georgia"/>
-          <w:sz w:val="22"/>
-        </w:rPr>
-        <w:t>Eine Linie führt über Felder, vorbei an der alten Eiche, tief in den Wald hinein.</w:t>
-      </w:r>
-    </w:p>
-    <w:p>
-      <w:pPr>
-        <w:spacing w:after="40"/>
-        <w:ind w:left="454" w:right="454"/>
-        <w:jc w:val="center"/>
-      </w:pPr>
-    </w:p>
-    <w:p>
-      <w:pPr>
-        <w:spacing w:after="40"/>
-        <w:ind w:left="454" w:right="454"/>
-        <w:jc w:val="center"/>
-      </w:pPr>
-      <w:r>
-        <w:rPr>
-          <w:rFonts w:ascii="Georgia" w:hAnsi="Georgia"/>
-          <w:sz w:val="22"/>
-        </w:rPr>
-        <w:t>Am Waldrand: eine Markierung.</w:t>
-      </w:r>
-    </w:p>
-    <w:p>
-      <w:pPr>
-        <w:spacing w:after="40"/>
-        <w:ind w:left="454" w:right="454"/>
-        <w:jc w:val="center"/>
-      </w:pPr>
-      <w:r>
-        <w:rPr>
-          <w:rFonts w:ascii="Georgia" w:hAnsi="Georgia"/>
-          <w:sz w:val="22"/>
-        </w:rPr>
-        <w:t>Ein Kreis, in die Rinde geritzt.</w:t>
-      </w:r>
-    </w:p>
-    <w:p>
-      <w:pPr>
-        <w:spacing w:after="40"/>
-        <w:ind w:left="454" w:right="454"/>
-        <w:jc w:val="center"/>
-      </w:pPr>
-      <w:r>
-        <w:rPr>
-          <w:rFonts w:ascii="Georgia" w:hAnsi="Georgia"/>
-          <w:sz w:val="22"/>
-        </w:rPr>
-        <w:t>Das gleiche Zeichen wie in den Gängen unter dem Dorf.</w:t>
-      </w:r>
-    </w:p>
-    <w:p>
-      <w:pPr>
-        <w:spacing w:after="40"/>
-        <w:ind w:left="454" w:right="454"/>
-        <w:jc w:val="center"/>
-      </w:pPr>
-    </w:p>
-    <w:p>
-      <w:pPr>
-        <w:spacing w:after="40"/>
-        <w:ind w:left="454" w:right="454"/>
-        <w:jc w:val="center"/>
-      </w:pPr>
-      <w:r>
-        <w:rPr>
-          <w:rFonts w:ascii="Georgia" w:hAnsi="Georgia"/>
-          <w:sz w:val="22"/>
-        </w:rPr>
-        <w:t>Jemand war vor ihnen dort.</w:t>
-      </w:r>
-    </w:p>
-    <w:p>
-      <w:pPr>
-        <w:spacing w:after="40"/>
-        <w:ind w:left="454" w:right="454"/>
-        <w:jc w:val="center"/>
-      </w:pPr>
-      <w:r>
-        <w:rPr>
-          <w:rFonts w:ascii="Georgia" w:hAnsi="Georgia"/>
-          <w:sz w:val="22"/>
-        </w:rPr>
-        <w:t>Vor langer Zeit.</w:t>
-      </w:r>
-    </w:p>
-    <w:p>
-      <w:pPr>
-        <w:spacing w:after="40"/>
-        <w:ind w:left="454" w:right="454"/>
-        <w:jc w:val="center"/>
-      </w:pPr>
-    </w:p>
-    <w:p>
-      <w:pPr>
-        <w:spacing w:after="40"/>
-        <w:ind w:left="454" w:right="454"/>
-        <w:jc w:val="center"/>
-      </w:pPr>
-      <w:r>
-        <w:rPr>
-          <w:rFonts w:ascii="Georgia" w:hAnsi="Georgia"/>
-          <w:sz w:val="22"/>
-        </w:rPr>
-        <w:t>Heinrich Winter hat sein ganzes Leben nach der zweiten Quelle gesucht.</w:t>
-      </w:r>
-    </w:p>
-    <w:p>
-      <w:pPr>
-        <w:spacing w:after="40"/>
-        <w:ind w:left="454" w:right="454"/>
-        <w:jc w:val="center"/>
-      </w:pPr>
-      <w:r>
-        <w:rPr>
-          <w:rFonts w:ascii="Georgia" w:hAnsi="Georgia"/>
-          <w:sz w:val="22"/>
-        </w:rPr>
-        <w:t>Jetzt will er nach Hause kommen.</w:t>
-      </w:r>
-    </w:p>
-    <w:p>
-      <w:pPr>
-        <w:spacing w:after="40"/>
-        <w:ind w:left="454" w:right="454"/>
-        <w:jc w:val="center"/>
-      </w:pPr>
-      <w:r>
-        <w:rPr>
-          <w:rFonts w:ascii="Georgia" w:hAnsi="Georgia"/>
-          <w:sz w:val="22"/>
-        </w:rPr>
-        <w:t>Aber zuerst müssen Jonas, Mila und Ben tun, was noch niemand geschafft hat.</w:t>
-      </w:r>
-    </w:p>
-    <w:p>
-      <w:pPr>
-        <w:spacing w:after="40"/>
-        <w:ind w:left="454" w:right="454"/>
-        <w:jc w:val="center"/>
-      </w:pPr>
-    </w:p>
-    <w:p>
-      <w:pPr>
-        <w:spacing w:after="40"/>
-        <w:ind w:left="454" w:right="454"/>
-        <w:jc w:val="center"/>
-      </w:pPr>
-      <w:r>
-        <w:rPr>
-          <w:rFonts w:ascii="Georgia" w:hAnsi="Georgia"/>
-          <w:sz w:val="22"/>
-        </w:rPr>
-        <w:t>Den Wald betreten.</w:t>
-      </w:r>
-    </w:p>
-    <w:p>
-      <w:pPr>
-        <w:spacing w:after="40"/>
-        <w:ind w:left="454" w:right="454"/>
-        <w:jc w:val="center"/>
-      </w:pPr>
-      <w:r>
-        <w:rPr>
-          <w:rFonts w:ascii="Georgia" w:hAnsi="Georgia"/>
-          <w:sz w:val="22"/>
-        </w:rPr>
-        <w:t>Und sein Geheimnis finden.</w:t>
-      </w:r>
-    </w:p>
-    <w:p/>
-    <w:p>
-      <w:pPr>
-        <w:spacing w:before="120" w:after="280"/>
-        <w:jc w:val="center"/>
-      </w:pPr>
-      <w:r>
-        <w:rPr>
-          <w:rFonts w:ascii="Georgia" w:hAnsi="Georgia"/>
-          <w:sz w:val="22"/>
-        </w:rPr>
-        <w:t>* * *</w:t>
-      </w:r>
-    </w:p>
-    <w:p>
-      <w:pPr>
-        <w:spacing w:after="320"/>
-        <w:jc w:val="center"/>
-      </w:pPr>
-      <w:r>
-        <w:rPr>
-          <w:rFonts w:ascii="Georgia" w:hAnsi="Georgia"/>
-          <w:i/>
-          <w:sz w:val="22"/>
-        </w:rPr>
-        <w:t>Was verbirgt der Wald seit Jahrhunderten?</w:t>
-        <w:br/>
-        <w:t>Warum geht niemand hinein?</w:t>
-        <w:br/>
-        <w:t>Und was hat Heinrich Winter dort gesehen?</w:t>
-      </w:r>
-    </w:p>
-    <w:p>
-      <w:pPr>
-        <w:spacing w:after="80"/>
-        <w:jc w:val="center"/>
-      </w:pPr>
-      <w:r>
-        <w:rPr>
-          <w:rFonts w:ascii="Georgia" w:hAnsi="Georgia"/>
-          <w:b/>
-          <w:sz w:val="26"/>
-        </w:rPr>
-        <w:t>Band 3: Die zweite Quelle</w:t>
-      </w:r>
-    </w:p>
-    <w:p>
-      <w:pPr>
-        <w:jc w:val="center"/>
-      </w:pPr>
-      <w:r>
-        <w:rPr>
-          <w:rFonts w:ascii="Georgia" w:hAnsi="Georgia"/>
-          <w:b/>
-          <w:sz w:val="24"/>
-        </w:rPr>
-        <w:t>Erscheint bald!</w:t>
+          <w:sz w:val="22"/>
+        </w:rPr>
+        <w:t>Das dritte große Abenteuer der Herrenhaus-Detektive.</w:t>
       </w:r>
     </w:p>
     <w:p>

</xml_diff>